<commit_message>
fix(staff): mise a jour de KOUAME GRACE vers KOUAME YVETTE (yvette.kouame@labelleporte.ci) et regeneration des documents Word et PDF
</commit_message>
<xml_diff>
--- a/doc/COMPTES_UTILISATEURS_ERP_LA_BELLE_PORTE.docx
+++ b/doc/COMPTES_UTILISATEURS_ERP_LA_BELLE_PORTE.docx
@@ -965,7 +965,7 @@
                 <w:color w:val="1A365D"/>
                 <w:sz w:val="17"/>
               </w:rPr>
-              <w:t>KOUAME GRACE</w:t>
+              <w:t>KOUAME YVETTE</w:t>
             </w:r>
           </w:p>
         </w:tc>
@@ -996,7 +996,7 @@
                 <w:color w:val="2B6CB0"/>
                 <w:sz w:val="17"/>
               </w:rPr>
-              <w:t>grace.kouame@labelleporte.ci</w:t>
+              <w:t>yvette.kouame@labelleporte.ci</w:t>
             </w:r>
           </w:p>
         </w:tc>

</xml_diff>

<commit_message>
feat(auth): attribution stricte et sans erreur des rôles, agences et permissions pour les 22 utilisateurs officiels
</commit_message>
<xml_diff>
--- a/doc/COMPTES_UTILISATEURS_ERP_LA_BELLE_PORTE.docx
+++ b/doc/COMPTES_UTILISATEURS_ERP_LA_BELLE_PORTE.docx
@@ -4,120 +4,60 @@
   <w:body>
     <w:p>
       <w:pPr>
+        <w:spacing w:after="40"/>
         <w:jc w:val="center"/>
       </w:pPr>
       <w:r>
         <w:rPr>
           <w:b/>
-          <w:color w:val="C59117"/>
+          <w:color w:val="0E2B5C"/>
+          <w:sz w:val="44"/>
+        </w:rPr>
+        <w:t>ERP LA BELLE PORTE</w:t>
+      </w:r>
+    </w:p>
+    <w:p>
+      <w:pPr>
+        <w:spacing w:after="280"/>
+        <w:jc w:val="center"/>
+      </w:pPr>
+      <w:r>
+        <w:rPr>
+          <w:b/>
+          <w:color w:val="B45309"/>
           <w:sz w:val="26"/>
         </w:rPr>
-        <w:t>LA BELLE PORTE TRANSIT &amp; SERVICES</w:t>
+        <w:t>RÉPERTOIRE OFFICIEL DES 22 COMPTES UTILISATEURS &amp; ATTRIBUTIONS</w:t>
+      </w:r>
+    </w:p>
+    <w:p>
+      <w:pPr>
+        <w:spacing w:before="80" w:after="200"/>
+      </w:pPr>
+      <w:r>
+        <w:rPr>
+          <w:b/>
+          <w:color w:val="0E2B5C"/>
+        </w:rPr>
+        <w:t>Note d'accès &amp; Sécurité :</w:t>
         <w:br/>
+      </w:r>
+      <w:r>
+        <w:t xml:space="preserve">• Mot de passe par défaut pour l'ensemble des comptes : </w:t>
       </w:r>
       <w:r>
         <w:rPr>
           <w:b/>
-          <w:color w:val="1A365D"/>
-          <w:sz w:val="36"/>
+          <w:color w:val="B91C1C"/>
         </w:rPr>
-        <w:t>FICHE D'IDENTIFIANTS &amp; ACCÈS UTILISATEURS ERP</w:t>
+        <w:t>lbp2026</w:t>
+        <w:br/>
       </w:r>
-    </w:p>
-    <w:p>
-      <w:pPr>
-        <w:jc w:val="center"/>
-      </w:pPr>
       <w:r>
-        <w:rPr>
-          <w:i/>
-          <w:color w:val="718096"/>
-          <w:sz w:val="20"/>
-        </w:rPr>
-        <w:t>Affectation des rôles, agences et identifiants de connexion au personnel</w:t>
+        <w:t>• URL de Connexion ERP : https://erp.labelleporte.ci/login</w:t>
         <w:br/>
-        <w:t>Date de génération : 07 Septembre 2026</w:t>
+        <w:t>• Chaque utilisateur est strictement rattaché à son agence d'affectation ou en accès multi-agences (Direction / Siège / Marketing / RH).</w:t>
       </w:r>
-    </w:p>
-    <w:p>
-      <w:pPr>
-        <w:spacing w:before="160" w:after="240"/>
-      </w:pPr>
-    </w:p>
-    <w:tbl>
-      <w:tblPr>
-        <w:tblW w:type="auto" w:w="0"/>
-        <w:jc w:val="center"/>
-        <w:tblLayout w:type="fixed"/>
-        <w:tblLook w:firstColumn="1" w:firstRow="1" w:lastColumn="0" w:lastRow="0" w:noHBand="0" w:noVBand="1" w:val="04A0"/>
-      </w:tblPr>
-      <w:tblGrid>
-        <w:gridCol w:w="10224"/>
-      </w:tblGrid>
-      <w:tr>
-        <w:tc>
-          <w:tcPr>
-            <w:tcW w:type="dxa" w:w="10224"/>
-            <w:shd w:fill="F7FAFC"/>
-            <w:tcBorders>
-              <w:top w:val="single" w:sz="4" w:space="0" w:color="CBD5E0"/>
-              <w:bottom w:val="single" w:sz="4" w:space="0" w:color="CBD5E0"/>
-              <w:left w:val="single" w:sz="4" w:space="0" w:color="1A365D"/>
-              <w:right w:val="single" w:sz="4" w:space="0" w:color="CBD5E0"/>
-            </w:tcBorders>
-            <w:tcMar>
-              <w:top w:w="140" w:type="dxa"/>
-              <w:bottom w:w="140" w:type="dxa"/>
-              <w:left w:w="200" w:type="dxa"/>
-              <w:right w:w="200" w:type="dxa"/>
-            </w:tcMar>
-          </w:tcPr>
-          <w:p>
-            <w:r>
-              <w:rPr>
-                <w:b/>
-                <w:color w:val="1A365D"/>
-                <w:sz w:val="20"/>
-              </w:rPr>
-              <w:t>ℹ️ INSTRUCTIONS DE CONNEXION :</w:t>
-              <w:br/>
-            </w:r>
-            <w:r>
-              <w:rPr>
-                <w:color w:val="2D3748"/>
-                <w:sz w:val="19"/>
-              </w:rPr>
-              <w:t>• URL de l'ERP : Accédez à la page de connexion de votre ERP La Belle Porte.</w:t>
-              <w:br/>
-              <w:t>• Identifiant : Adresse e-mail professionnelle (@labelleporte.ci).</w:t>
-              <w:br/>
-              <w:t xml:space="preserve">• Mot de passe par défaut : </w:t>
-            </w:r>
-            <w:r>
-              <w:rPr>
-                <w:b/>
-                <w:color w:val="C53030"/>
-                <w:sz w:val="20"/>
-              </w:rPr>
-              <w:t>lbp2026</w:t>
-              <w:br/>
-            </w:r>
-            <w:r>
-              <w:rPr>
-                <w:i/>
-                <w:color w:val="718096"/>
-                <w:sz w:val="18"/>
-              </w:rPr>
-              <w:t>• Recommandation : Chaque utilisateur est invité à modifier son mot de passe lors de sa première session.</w:t>
-            </w:r>
-          </w:p>
-        </w:tc>
-      </w:tr>
-    </w:tbl>
-    <w:p>
-      <w:pPr>
-        <w:spacing w:after="80"/>
-      </w:pPr>
     </w:p>
     <w:tbl>
       <w:tblPr>
@@ -135,26 +75,10 @@
         <w:gridCol w:w="1704"/>
       </w:tblGrid>
       <w:tr>
-        <w:trPr>
-          <w:tblHeader/>
-        </w:trPr>
         <w:tc>
           <w:tcPr>
             <w:tcW w:type="dxa" w:w="576"/>
-            <w:shd w:fill="1A365D"/>
-            <w:tcMar>
-              <w:top w:w="120" w:type="dxa"/>
-              <w:bottom w:w="120" w:type="dxa"/>
-              <w:left w:w="100" w:type="dxa"/>
-              <w:right w:w="100" w:type="dxa"/>
-            </w:tcMar>
-            <w:tcBorders>
-              <w:top w:val="single" w:sz="4" w:space="0" w:color="1A365D"/>
-              <w:bottom w:val="single" w:sz="4" w:space="0" w:color="C59117"/>
-              <w:left w:val="none"/>
-              <w:right w:val="none"/>
-            </w:tcBorders>
-            <w:vAlign w:val="center"/>
+            <w:shd w:fill="0E2B5C"/>
           </w:tcPr>
           <w:p>
             <w:pPr>
@@ -164,93 +88,16 @@
               <w:rPr>
                 <w:b/>
                 <w:color w:val="FFFFFF"/>
-                <w:sz w:val="18"/>
+                <w:sz w:val="19"/>
               </w:rPr>
-              <w:t>#</w:t>
+              <w:t>N°</w:t>
             </w:r>
           </w:p>
         </w:tc>
         <w:tc>
           <w:tcPr>
-            <w:tcW w:type="dxa" w:w="2448"/>
-            <w:shd w:fill="1A365D"/>
-            <w:tcMar>
-              <w:top w:w="120" w:type="dxa"/>
-              <w:bottom w:w="120" w:type="dxa"/>
-              <w:left w:w="100" w:type="dxa"/>
-              <w:right w:w="100" w:type="dxa"/>
-            </w:tcMar>
-            <w:tcBorders>
-              <w:top w:val="single" w:sz="4" w:space="0" w:color="1A365D"/>
-              <w:bottom w:val="single" w:sz="4" w:space="0" w:color="C59117"/>
-              <w:left w:val="none"/>
-              <w:right w:val="none"/>
-            </w:tcBorders>
-            <w:vAlign w:val="center"/>
-          </w:tcPr>
-          <w:p>
-            <w:pPr>
-              <w:jc w:val="left"/>
-            </w:pPr>
-            <w:r>
-              <w:rPr>
-                <w:b/>
-                <w:color w:val="FFFFFF"/>
-                <w:sz w:val="18"/>
-              </w:rPr>
-              <w:t>Nom &amp; Prénoms</w:t>
-            </w:r>
-          </w:p>
-        </w:tc>
-        <w:tc>
-          <w:tcPr>
-            <w:tcW w:type="dxa" w:w="2736"/>
-            <w:shd w:fill="1A365D"/>
-            <w:tcMar>
-              <w:top w:w="120" w:type="dxa"/>
-              <w:bottom w:w="120" w:type="dxa"/>
-              <w:left w:w="100" w:type="dxa"/>
-              <w:right w:w="100" w:type="dxa"/>
-            </w:tcMar>
-            <w:tcBorders>
-              <w:top w:val="single" w:sz="4" w:space="0" w:color="1A365D"/>
-              <w:bottom w:val="single" w:sz="4" w:space="0" w:color="C59117"/>
-              <w:left w:val="none"/>
-              <w:right w:val="none"/>
-            </w:tcBorders>
-            <w:vAlign w:val="center"/>
-          </w:tcPr>
-          <w:p>
-            <w:pPr>
-              <w:jc w:val="left"/>
-            </w:pPr>
-            <w:r>
-              <w:rPr>
-                <w:b/>
-                <w:color w:val="FFFFFF"/>
-                <w:sz w:val="18"/>
-              </w:rPr>
-              <w:t>Adresse E-mail</w:t>
-            </w:r>
-          </w:p>
-        </w:tc>
-        <w:tc>
-          <w:tcPr>
-            <w:tcW w:type="dxa" w:w="1296"/>
-            <w:shd w:fill="1A365D"/>
-            <w:tcMar>
-              <w:top w:w="120" w:type="dxa"/>
-              <w:bottom w:w="120" w:type="dxa"/>
-              <w:left w:w="100" w:type="dxa"/>
-              <w:right w:w="100" w:type="dxa"/>
-            </w:tcMar>
-            <w:tcBorders>
-              <w:top w:val="single" w:sz="4" w:space="0" w:color="1A365D"/>
-              <w:bottom w:val="single" w:sz="4" w:space="0" w:color="C59117"/>
-              <w:left w:val="none"/>
-              <w:right w:val="none"/>
-            </w:tcBorders>
-            <w:vAlign w:val="center"/>
+            <w:tcW w:type="dxa" w:w="2160"/>
+            <w:shd w:fill="0E2B5C"/>
           </w:tcPr>
           <w:p>
             <w:pPr>
@@ -260,73 +107,85 @@
               <w:rPr>
                 <w:b/>
                 <w:color w:val="FFFFFF"/>
-                <w:sz w:val="18"/>
+                <w:sz w:val="19"/>
               </w:rPr>
-              <w:t>Mot de Passe</w:t>
+              <w:t>Collaborateur</w:t>
             </w:r>
           </w:p>
         </w:tc>
         <w:tc>
           <w:tcPr>
-            <w:tcW w:type="dxa" w:w="1584"/>
-            <w:shd w:fill="1A365D"/>
-            <w:tcMar>
-              <w:top w:w="120" w:type="dxa"/>
-              <w:bottom w:w="120" w:type="dxa"/>
-              <w:left w:w="100" w:type="dxa"/>
-              <w:right w:w="100" w:type="dxa"/>
-            </w:tcMar>
-            <w:tcBorders>
-              <w:top w:val="single" w:sz="4" w:space="0" w:color="1A365D"/>
-              <w:bottom w:val="single" w:sz="4" w:space="0" w:color="C59117"/>
-              <w:left w:val="none"/>
-              <w:right w:val="none"/>
-            </w:tcBorders>
-            <w:vAlign w:val="center"/>
+            <w:tcW w:type="dxa" w:w="2592"/>
+            <w:shd w:fill="0E2B5C"/>
           </w:tcPr>
           <w:p>
             <w:pPr>
-              <w:jc w:val="left"/>
+              <w:jc w:val="center"/>
             </w:pPr>
             <w:r>
               <w:rPr>
                 <w:b/>
                 <w:color w:val="FFFFFF"/>
-                <w:sz w:val="18"/>
+                <w:sz w:val="19"/>
               </w:rPr>
-              <w:t>Agence</w:t>
+              <w:t>Email Connexion</w:t>
             </w:r>
           </w:p>
         </w:tc>
         <w:tc>
           <w:tcPr>
-            <w:tcW w:type="dxa" w:w="1584"/>
-            <w:shd w:fill="1A365D"/>
-            <w:tcMar>
-              <w:top w:w="120" w:type="dxa"/>
-              <w:bottom w:w="120" w:type="dxa"/>
-              <w:left w:w="100" w:type="dxa"/>
-              <w:right w:w="100" w:type="dxa"/>
-            </w:tcMar>
-            <w:tcBorders>
-              <w:top w:val="single" w:sz="4" w:space="0" w:color="1A365D"/>
-              <w:bottom w:val="single" w:sz="4" w:space="0" w:color="C59117"/>
-              <w:left w:val="none"/>
-              <w:right w:val="none"/>
-            </w:tcBorders>
-            <w:vAlign w:val="center"/>
+            <w:tcW w:type="dxa" w:w="1872"/>
+            <w:shd w:fill="0E2B5C"/>
           </w:tcPr>
           <w:p>
             <w:pPr>
-              <w:jc w:val="left"/>
+              <w:jc w:val="center"/>
             </w:pPr>
             <w:r>
               <w:rPr>
                 <w:b/>
                 <w:color w:val="FFFFFF"/>
-                <w:sz w:val="18"/>
+                <w:sz w:val="19"/>
               </w:rPr>
-              <w:t>Rôle / Poste</w:t>
+              <w:t>Fonction / Rôle</w:t>
+            </w:r>
+          </w:p>
+        </w:tc>
+        <w:tc>
+          <w:tcPr>
+            <w:tcW w:type="dxa" w:w="1728"/>
+            <w:shd w:fill="0E2B5C"/>
+          </w:tcPr>
+          <w:p>
+            <w:pPr>
+              <w:jc w:val="center"/>
+            </w:pPr>
+            <w:r>
+              <w:rPr>
+                <w:b/>
+                <w:color w:val="FFFFFF"/>
+                <w:sz w:val="19"/>
+              </w:rPr>
+              <w:t>Affectation</w:t>
+            </w:r>
+          </w:p>
+        </w:tc>
+        <w:tc>
+          <w:tcPr>
+            <w:tcW w:type="dxa" w:w="1296"/>
+            <w:shd w:fill="0E2B5C"/>
+          </w:tcPr>
+          <w:p>
+            <w:pPr>
+              <w:jc w:val="center"/>
+            </w:pPr>
+            <w:r>
+              <w:rPr>
+                <w:b/>
+                <w:color w:val="FFFFFF"/>
+                <w:sz w:val="19"/>
+              </w:rPr>
+              <w:t>Mot de Passe</w:t>
             </w:r>
           </w:p>
         </w:tc>
@@ -336,60 +195,36 @@
           <w:tcPr>
             <w:tcW w:type="dxa" w:w="576"/>
             <w:shd w:fill="FFFFFF"/>
-            <w:tcMar>
-              <w:top w:w="100" w:type="dxa"/>
-              <w:bottom w:w="100" w:type="dxa"/>
-              <w:left w:w="100" w:type="dxa"/>
-              <w:right w:w="100" w:type="dxa"/>
-            </w:tcMar>
-            <w:tcBorders>
-              <w:top w:val="single" w:sz="4" w:space="0" w:color="E2E8F0"/>
-              <w:bottom w:val="single" w:sz="4" w:space="0" w:color="E2E8F0"/>
-              <w:left w:val="none"/>
-              <w:right w:val="none"/>
-            </w:tcBorders>
             <w:vAlign w:val="center"/>
           </w:tcPr>
           <w:p>
             <w:pPr>
+              <w:spacing w:before="60" w:after="60"/>
               <w:jc w:val="center"/>
             </w:pPr>
             <w:r>
               <w:rPr>
                 <w:b/>
-                <w:color w:val="718096"/>
                 <w:sz w:val="17"/>
               </w:rPr>
-              <w:t>01</w:t>
+              <w:t>1</w:t>
             </w:r>
           </w:p>
         </w:tc>
         <w:tc>
           <w:tcPr>
-            <w:tcW w:type="dxa" w:w="2448"/>
+            <w:tcW w:type="dxa" w:w="2160"/>
             <w:shd w:fill="FFFFFF"/>
-            <w:tcMar>
-              <w:top w:w="100" w:type="dxa"/>
-              <w:bottom w:w="100" w:type="dxa"/>
-              <w:left w:w="100" w:type="dxa"/>
-              <w:right w:w="100" w:type="dxa"/>
-            </w:tcMar>
-            <w:tcBorders>
-              <w:top w:val="single" w:sz="4" w:space="0" w:color="E2E8F0"/>
-              <w:bottom w:val="single" w:sz="4" w:space="0" w:color="E2E8F0"/>
-              <w:left w:val="none"/>
-              <w:right w:val="none"/>
-            </w:tcBorders>
             <w:vAlign w:val="center"/>
           </w:tcPr>
           <w:p>
             <w:pPr>
-              <w:jc w:val="left"/>
+              <w:spacing w:before="60" w:after="60"/>
             </w:pPr>
             <w:r>
               <w:rPr>
                 <w:b/>
-                <w:color w:val="1A365D"/>
+                <w:color w:val="0F172A"/>
                 <w:sz w:val="17"/>
               </w:rPr>
               <w:t>AKOIBLIN ROXANE</w:t>
@@ -398,29 +233,17 @@
         </w:tc>
         <w:tc>
           <w:tcPr>
-            <w:tcW w:type="dxa" w:w="2736"/>
+            <w:tcW w:type="dxa" w:w="2592"/>
             <w:shd w:fill="FFFFFF"/>
-            <w:tcMar>
-              <w:top w:w="100" w:type="dxa"/>
-              <w:bottom w:w="100" w:type="dxa"/>
-              <w:left w:w="100" w:type="dxa"/>
-              <w:right w:w="100" w:type="dxa"/>
-            </w:tcMar>
-            <w:tcBorders>
-              <w:top w:val="single" w:sz="4" w:space="0" w:color="E2E8F0"/>
-              <w:bottom w:val="single" w:sz="4" w:space="0" w:color="E2E8F0"/>
-              <w:left w:val="none"/>
-              <w:right w:val="none"/>
-            </w:tcBorders>
             <w:vAlign w:val="center"/>
           </w:tcPr>
           <w:p>
             <w:pPr>
-              <w:jc w:val="left"/>
+              <w:spacing w:before="60" w:after="60"/>
             </w:pPr>
             <w:r>
               <w:rPr>
-                <w:color w:val="2B6CB0"/>
+                <w:color w:val="0284C7"/>
                 <w:sz w:val="17"/>
               </w:rPr>
               <w:t>roxane.akoiblin@labelleporte.ci</w:t>
@@ -429,61 +252,34 @@
         </w:tc>
         <w:tc>
           <w:tcPr>
-            <w:tcW w:type="dxa" w:w="1296"/>
+            <w:tcW w:type="dxa" w:w="1872"/>
             <w:shd w:fill="FFFFFF"/>
-            <w:tcMar>
-              <w:top w:w="100" w:type="dxa"/>
-              <w:bottom w:w="100" w:type="dxa"/>
-              <w:left w:w="100" w:type="dxa"/>
-              <w:right w:w="100" w:type="dxa"/>
-            </w:tcMar>
-            <w:tcBorders>
-              <w:top w:val="single" w:sz="4" w:space="0" w:color="E2E8F0"/>
-              <w:bottom w:val="single" w:sz="4" w:space="0" w:color="E2E8F0"/>
-              <w:left w:val="none"/>
-              <w:right w:val="none"/>
-            </w:tcBorders>
             <w:vAlign w:val="center"/>
           </w:tcPr>
           <w:p>
             <w:pPr>
-              <w:jc w:val="center"/>
+              <w:spacing w:before="60" w:after="60"/>
             </w:pPr>
             <w:r>
               <w:rPr>
-                <w:b/>
-                <w:color w:val="C53030"/>
                 <w:sz w:val="17"/>
               </w:rPr>
-              <w:t>lbp2026</w:t>
+              <w:t>CHEF D'AGENCE</w:t>
             </w:r>
           </w:p>
         </w:tc>
         <w:tc>
           <w:tcPr>
-            <w:tcW w:type="dxa" w:w="1584"/>
+            <w:tcW w:type="dxa" w:w="1728"/>
             <w:shd w:fill="FFFFFF"/>
-            <w:tcMar>
-              <w:top w:w="100" w:type="dxa"/>
-              <w:bottom w:w="100" w:type="dxa"/>
-              <w:left w:w="100" w:type="dxa"/>
-              <w:right w:w="100" w:type="dxa"/>
-            </w:tcMar>
-            <w:tcBorders>
-              <w:top w:val="single" w:sz="4" w:space="0" w:color="E2E8F0"/>
-              <w:bottom w:val="single" w:sz="4" w:space="0" w:color="E2E8F0"/>
-              <w:left w:val="none"/>
-              <w:right w:val="none"/>
-            </w:tcBorders>
             <w:vAlign w:val="center"/>
           </w:tcPr>
           <w:p>
             <w:pPr>
-              <w:jc w:val="left"/>
+              <w:spacing w:before="60" w:after="60"/>
             </w:pPr>
             <w:r>
               <w:rPr>
-                <w:color w:val="2D3748"/>
                 <w:sz w:val="17"/>
               </w:rPr>
               <w:t>Agence Adjamé</w:t>
@@ -492,32 +288,22 @@
         </w:tc>
         <w:tc>
           <w:tcPr>
-            <w:tcW w:type="dxa" w:w="1584"/>
+            <w:tcW w:type="dxa" w:w="1296"/>
             <w:shd w:fill="FFFFFF"/>
-            <w:tcMar>
-              <w:top w:w="100" w:type="dxa"/>
-              <w:bottom w:w="100" w:type="dxa"/>
-              <w:left w:w="100" w:type="dxa"/>
-              <w:right w:w="100" w:type="dxa"/>
-            </w:tcMar>
-            <w:tcBorders>
-              <w:top w:val="single" w:sz="4" w:space="0" w:color="E2E8F0"/>
-              <w:bottom w:val="single" w:sz="4" w:space="0" w:color="E2E8F0"/>
-              <w:left w:val="none"/>
-              <w:right w:val="none"/>
-            </w:tcBorders>
             <w:vAlign w:val="center"/>
           </w:tcPr>
           <w:p>
             <w:pPr>
-              <w:jc w:val="left"/>
+              <w:spacing w:before="60" w:after="60"/>
+              <w:jc w:val="center"/>
             </w:pPr>
             <w:r>
               <w:rPr>
-                <w:color w:val="2D3748"/>
+                <w:b/>
+                <w:color w:val="B91C1C"/>
                 <w:sz w:val="17"/>
               </w:rPr>
-              <w:t>Chef d'Agence</w:t>
+              <w:t>lbp2026</w:t>
             </w:r>
           </w:p>
         </w:tc>
@@ -526,61 +312,37 @@
         <w:tc>
           <w:tcPr>
             <w:tcW w:type="dxa" w:w="576"/>
-            <w:shd w:fill="F7FAFC"/>
-            <w:tcMar>
-              <w:top w:w="100" w:type="dxa"/>
-              <w:bottom w:w="100" w:type="dxa"/>
-              <w:left w:w="100" w:type="dxa"/>
-              <w:right w:w="100" w:type="dxa"/>
-            </w:tcMar>
-            <w:tcBorders>
-              <w:top w:val="single" w:sz="4" w:space="0" w:color="E2E8F0"/>
-              <w:bottom w:val="single" w:sz="4" w:space="0" w:color="E2E8F0"/>
-              <w:left w:val="none"/>
-              <w:right w:val="none"/>
-            </w:tcBorders>
+            <w:shd w:fill="F8FAFC"/>
             <w:vAlign w:val="center"/>
           </w:tcPr>
           <w:p>
             <w:pPr>
+              <w:spacing w:before="60" w:after="60"/>
               <w:jc w:val="center"/>
             </w:pPr>
             <w:r>
               <w:rPr>
                 <w:b/>
-                <w:color w:val="718096"/>
                 <w:sz w:val="17"/>
               </w:rPr>
-              <w:t>02</w:t>
+              <w:t>2</w:t>
             </w:r>
           </w:p>
         </w:tc>
         <w:tc>
           <w:tcPr>
-            <w:tcW w:type="dxa" w:w="2448"/>
-            <w:shd w:fill="F7FAFC"/>
-            <w:tcMar>
-              <w:top w:w="100" w:type="dxa"/>
-              <w:bottom w:w="100" w:type="dxa"/>
-              <w:left w:w="100" w:type="dxa"/>
-              <w:right w:w="100" w:type="dxa"/>
-            </w:tcMar>
-            <w:tcBorders>
-              <w:top w:val="single" w:sz="4" w:space="0" w:color="E2E8F0"/>
-              <w:bottom w:val="single" w:sz="4" w:space="0" w:color="E2E8F0"/>
-              <w:left w:val="none"/>
-              <w:right w:val="none"/>
-            </w:tcBorders>
+            <w:tcW w:type="dxa" w:w="2160"/>
+            <w:shd w:fill="F8FAFC"/>
             <w:vAlign w:val="center"/>
           </w:tcPr>
           <w:p>
             <w:pPr>
-              <w:jc w:val="left"/>
+              <w:spacing w:before="60" w:after="60"/>
             </w:pPr>
             <w:r>
               <w:rPr>
                 <w:b/>
-                <w:color w:val="1A365D"/>
+                <w:color w:val="0F172A"/>
                 <w:sz w:val="17"/>
               </w:rPr>
               <w:t>KOUAKOU SALES</w:t>
@@ -589,126 +351,77 @@
         </w:tc>
         <w:tc>
           <w:tcPr>
-            <w:tcW w:type="dxa" w:w="2736"/>
-            <w:shd w:fill="F7FAFC"/>
-            <w:tcMar>
-              <w:top w:w="100" w:type="dxa"/>
-              <w:bottom w:w="100" w:type="dxa"/>
-              <w:left w:w="100" w:type="dxa"/>
-              <w:right w:w="100" w:type="dxa"/>
-            </w:tcMar>
-            <w:tcBorders>
-              <w:top w:val="single" w:sz="4" w:space="0" w:color="E2E8F0"/>
-              <w:bottom w:val="single" w:sz="4" w:space="0" w:color="E2E8F0"/>
-              <w:left w:val="none"/>
-              <w:right w:val="none"/>
-            </w:tcBorders>
+            <w:tcW w:type="dxa" w:w="2592"/>
+            <w:shd w:fill="F8FAFC"/>
             <w:vAlign w:val="center"/>
           </w:tcPr>
           <w:p>
             <w:pPr>
-              <w:jc w:val="left"/>
+              <w:spacing w:before="60" w:after="60"/>
             </w:pPr>
             <w:r>
               <w:rPr>
-                <w:color w:val="2B6CB0"/>
+                <w:color w:val="0284C7"/>
                 <w:sz w:val="17"/>
               </w:rPr>
-              <w:t>sales.kouakou@labelleporte.ci</w:t>
+              <w:t>kouakou.sales@labelleporte.ci</w:t>
+            </w:r>
+          </w:p>
+        </w:tc>
+        <w:tc>
+          <w:tcPr>
+            <w:tcW w:type="dxa" w:w="1872"/>
+            <w:shd w:fill="F8FAFC"/>
+            <w:vAlign w:val="center"/>
+          </w:tcPr>
+          <w:p>
+            <w:pPr>
+              <w:spacing w:before="60" w:after="60"/>
+            </w:pPr>
+            <w:r>
+              <w:rPr>
+                <w:sz w:val="17"/>
+              </w:rPr>
+              <w:t>RESPONSABLE GROUPAGE GENERAL</w:t>
+            </w:r>
+          </w:p>
+        </w:tc>
+        <w:tc>
+          <w:tcPr>
+            <w:tcW w:type="dxa" w:w="1728"/>
+            <w:shd w:fill="F8FAFC"/>
+            <w:vAlign w:val="center"/>
+          </w:tcPr>
+          <w:p>
+            <w:pPr>
+              <w:spacing w:before="60" w:after="60"/>
+            </w:pPr>
+            <w:r>
+              <w:rPr>
+                <w:sz w:val="17"/>
+              </w:rPr>
+              <w:t>Toutes les agences</w:t>
             </w:r>
           </w:p>
         </w:tc>
         <w:tc>
           <w:tcPr>
             <w:tcW w:type="dxa" w:w="1296"/>
-            <w:shd w:fill="F7FAFC"/>
-            <w:tcMar>
-              <w:top w:w="100" w:type="dxa"/>
-              <w:bottom w:w="100" w:type="dxa"/>
-              <w:left w:w="100" w:type="dxa"/>
-              <w:right w:w="100" w:type="dxa"/>
-            </w:tcMar>
-            <w:tcBorders>
-              <w:top w:val="single" w:sz="4" w:space="0" w:color="E2E8F0"/>
-              <w:bottom w:val="single" w:sz="4" w:space="0" w:color="E2E8F0"/>
-              <w:left w:val="none"/>
-              <w:right w:val="none"/>
-            </w:tcBorders>
+            <w:shd w:fill="F8FAFC"/>
             <w:vAlign w:val="center"/>
           </w:tcPr>
           <w:p>
             <w:pPr>
+              <w:spacing w:before="60" w:after="60"/>
               <w:jc w:val="center"/>
             </w:pPr>
             <w:r>
               <w:rPr>
                 <w:b/>
-                <w:color w:val="C53030"/>
+                <w:color w:val="B91C1C"/>
                 <w:sz w:val="17"/>
               </w:rPr>
               <w:t>lbp2026</w:t>
-            </w:r>
-          </w:p>
-        </w:tc>
-        <w:tc>
-          <w:tcPr>
-            <w:tcW w:type="dxa" w:w="1584"/>
-            <w:shd w:fill="F7FAFC"/>
-            <w:tcMar>
-              <w:top w:w="100" w:type="dxa"/>
-              <w:bottom w:w="100" w:type="dxa"/>
-              <w:left w:w="100" w:type="dxa"/>
-              <w:right w:w="100" w:type="dxa"/>
-            </w:tcMar>
-            <w:tcBorders>
-              <w:top w:val="single" w:sz="4" w:space="0" w:color="E2E8F0"/>
-              <w:bottom w:val="single" w:sz="4" w:space="0" w:color="E2E8F0"/>
-              <w:left w:val="none"/>
-              <w:right w:val="none"/>
-            </w:tcBorders>
-            <w:vAlign w:val="center"/>
-          </w:tcPr>
-          <w:p>
-            <w:pPr>
-              <w:jc w:val="left"/>
-            </w:pPr>
-            <w:r>
-              <w:rPr>
-                <w:color w:val="2D3748"/>
-                <w:sz w:val="17"/>
-              </w:rPr>
-              <w:t>Siège Abidjan</w:t>
-            </w:r>
-          </w:p>
-        </w:tc>
-        <w:tc>
-          <w:tcPr>
-            <w:tcW w:type="dxa" w:w="1584"/>
-            <w:shd w:fill="F7FAFC"/>
-            <w:tcMar>
-              <w:top w:w="100" w:type="dxa"/>
-              <w:bottom w:w="100" w:type="dxa"/>
-              <w:left w:w="100" w:type="dxa"/>
-              <w:right w:w="100" w:type="dxa"/>
-            </w:tcMar>
-            <w:tcBorders>
-              <w:top w:val="single" w:sz="4" w:space="0" w:color="E2E8F0"/>
-              <w:bottom w:val="single" w:sz="4" w:space="0" w:color="E2E8F0"/>
-              <w:left w:val="none"/>
-              <w:right w:val="none"/>
-            </w:tcBorders>
-            <w:vAlign w:val="center"/>
-          </w:tcPr>
-          <w:p>
-            <w:pPr>
-              <w:jc w:val="left"/>
-            </w:pPr>
-            <w:r>
-              <w:rPr>
-                <w:color w:val="2D3748"/>
-                <w:sz w:val="17"/>
-              </w:rPr>
-              <w:t>Responsable Groupage</w:t>
             </w:r>
           </w:p>
         </w:tc>
@@ -718,60 +431,36 @@
           <w:tcPr>
             <w:tcW w:type="dxa" w:w="576"/>
             <w:shd w:fill="FFFFFF"/>
-            <w:tcMar>
-              <w:top w:w="100" w:type="dxa"/>
-              <w:bottom w:w="100" w:type="dxa"/>
-              <w:left w:w="100" w:type="dxa"/>
-              <w:right w:w="100" w:type="dxa"/>
-            </w:tcMar>
-            <w:tcBorders>
-              <w:top w:val="single" w:sz="4" w:space="0" w:color="E2E8F0"/>
-              <w:bottom w:val="single" w:sz="4" w:space="0" w:color="E2E8F0"/>
-              <w:left w:val="none"/>
-              <w:right w:val="none"/>
-            </w:tcBorders>
             <w:vAlign w:val="center"/>
           </w:tcPr>
           <w:p>
             <w:pPr>
+              <w:spacing w:before="60" w:after="60"/>
               <w:jc w:val="center"/>
             </w:pPr>
             <w:r>
               <w:rPr>
                 <w:b/>
-                <w:color w:val="718096"/>
                 <w:sz w:val="17"/>
               </w:rPr>
-              <w:t>03</w:t>
+              <w:t>3</w:t>
             </w:r>
           </w:p>
         </w:tc>
         <w:tc>
           <w:tcPr>
-            <w:tcW w:type="dxa" w:w="2448"/>
+            <w:tcW w:type="dxa" w:w="2160"/>
             <w:shd w:fill="FFFFFF"/>
-            <w:tcMar>
-              <w:top w:w="100" w:type="dxa"/>
-              <w:bottom w:w="100" w:type="dxa"/>
-              <w:left w:w="100" w:type="dxa"/>
-              <w:right w:w="100" w:type="dxa"/>
-            </w:tcMar>
-            <w:tcBorders>
-              <w:top w:val="single" w:sz="4" w:space="0" w:color="E2E8F0"/>
-              <w:bottom w:val="single" w:sz="4" w:space="0" w:color="E2E8F0"/>
-              <w:left w:val="none"/>
-              <w:right w:val="none"/>
-            </w:tcBorders>
             <w:vAlign w:val="center"/>
           </w:tcPr>
           <w:p>
             <w:pPr>
-              <w:jc w:val="left"/>
+              <w:spacing w:before="60" w:after="60"/>
             </w:pPr>
             <w:r>
               <w:rPr>
                 <w:b/>
-                <w:color w:val="1A365D"/>
+                <w:color w:val="0F172A"/>
                 <w:sz w:val="17"/>
               </w:rPr>
               <w:t>DIARRA SIAKA</w:t>
@@ -780,29 +469,17 @@
         </w:tc>
         <w:tc>
           <w:tcPr>
-            <w:tcW w:type="dxa" w:w="2736"/>
+            <w:tcW w:type="dxa" w:w="2592"/>
             <w:shd w:fill="FFFFFF"/>
-            <w:tcMar>
-              <w:top w:w="100" w:type="dxa"/>
-              <w:bottom w:w="100" w:type="dxa"/>
-              <w:left w:w="100" w:type="dxa"/>
-              <w:right w:w="100" w:type="dxa"/>
-            </w:tcMar>
-            <w:tcBorders>
-              <w:top w:val="single" w:sz="4" w:space="0" w:color="E2E8F0"/>
-              <w:bottom w:val="single" w:sz="4" w:space="0" w:color="E2E8F0"/>
-              <w:left w:val="none"/>
-              <w:right w:val="none"/>
-            </w:tcBorders>
             <w:vAlign w:val="center"/>
           </w:tcPr>
           <w:p>
             <w:pPr>
-              <w:jc w:val="left"/>
+              <w:spacing w:before="60" w:after="60"/>
             </w:pPr>
             <w:r>
               <w:rPr>
-                <w:color w:val="2B6CB0"/>
+                <w:color w:val="0284C7"/>
                 <w:sz w:val="17"/>
               </w:rPr>
               <w:t>siaka.diarra@labelleporte.ci</w:t>
@@ -811,95 +488,58 @@
         </w:tc>
         <w:tc>
           <w:tcPr>
-            <w:tcW w:type="dxa" w:w="1296"/>
+            <w:tcW w:type="dxa" w:w="1872"/>
             <w:shd w:fill="FFFFFF"/>
-            <w:tcMar>
-              <w:top w:w="100" w:type="dxa"/>
-              <w:bottom w:w="100" w:type="dxa"/>
-              <w:left w:w="100" w:type="dxa"/>
-              <w:right w:w="100" w:type="dxa"/>
-            </w:tcMar>
-            <w:tcBorders>
-              <w:top w:val="single" w:sz="4" w:space="0" w:color="E2E8F0"/>
-              <w:bottom w:val="single" w:sz="4" w:space="0" w:color="E2E8F0"/>
-              <w:left w:val="none"/>
-              <w:right w:val="none"/>
-            </w:tcBorders>
             <w:vAlign w:val="center"/>
           </w:tcPr>
           <w:p>
             <w:pPr>
+              <w:spacing w:before="60" w:after="60"/>
+            </w:pPr>
+            <w:r>
+              <w:rPr>
+                <w:sz w:val="17"/>
+              </w:rPr>
+              <w:t>CHEF D'AGENCE</w:t>
+            </w:r>
+          </w:p>
+        </w:tc>
+        <w:tc>
+          <w:tcPr>
+            <w:tcW w:type="dxa" w:w="1728"/>
+            <w:shd w:fill="FFFFFF"/>
+            <w:vAlign w:val="center"/>
+          </w:tcPr>
+          <w:p>
+            <w:pPr>
+              <w:spacing w:before="60" w:after="60"/>
+            </w:pPr>
+            <w:r>
+              <w:rPr>
+                <w:sz w:val="17"/>
+              </w:rPr>
+              <w:t>Agence Abobo Dokui</w:t>
+            </w:r>
+          </w:p>
+        </w:tc>
+        <w:tc>
+          <w:tcPr>
+            <w:tcW w:type="dxa" w:w="1296"/>
+            <w:shd w:fill="FFFFFF"/>
+            <w:vAlign w:val="center"/>
+          </w:tcPr>
+          <w:p>
+            <w:pPr>
+              <w:spacing w:before="60" w:after="60"/>
               <w:jc w:val="center"/>
             </w:pPr>
             <w:r>
               <w:rPr>
                 <w:b/>
-                <w:color w:val="C53030"/>
+                <w:color w:val="B91C1C"/>
                 <w:sz w:val="17"/>
               </w:rPr>
               <w:t>lbp2026</w:t>
-            </w:r>
-          </w:p>
-        </w:tc>
-        <w:tc>
-          <w:tcPr>
-            <w:tcW w:type="dxa" w:w="1584"/>
-            <w:shd w:fill="FFFFFF"/>
-            <w:tcMar>
-              <w:top w:w="100" w:type="dxa"/>
-              <w:bottom w:w="100" w:type="dxa"/>
-              <w:left w:w="100" w:type="dxa"/>
-              <w:right w:w="100" w:type="dxa"/>
-            </w:tcMar>
-            <w:tcBorders>
-              <w:top w:val="single" w:sz="4" w:space="0" w:color="E2E8F0"/>
-              <w:bottom w:val="single" w:sz="4" w:space="0" w:color="E2E8F0"/>
-              <w:left w:val="none"/>
-              <w:right w:val="none"/>
-            </w:tcBorders>
-            <w:vAlign w:val="center"/>
-          </w:tcPr>
-          <w:p>
-            <w:pPr>
-              <w:jc w:val="left"/>
-            </w:pPr>
-            <w:r>
-              <w:rPr>
-                <w:color w:val="2D3748"/>
-                <w:sz w:val="17"/>
-              </w:rPr>
-              <w:t>Agence Dokui</w:t>
-            </w:r>
-          </w:p>
-        </w:tc>
-        <w:tc>
-          <w:tcPr>
-            <w:tcW w:type="dxa" w:w="1584"/>
-            <w:shd w:fill="FFFFFF"/>
-            <w:tcMar>
-              <w:top w:w="100" w:type="dxa"/>
-              <w:bottom w:w="100" w:type="dxa"/>
-              <w:left w:w="100" w:type="dxa"/>
-              <w:right w:w="100" w:type="dxa"/>
-            </w:tcMar>
-            <w:tcBorders>
-              <w:top w:val="single" w:sz="4" w:space="0" w:color="E2E8F0"/>
-              <w:bottom w:val="single" w:sz="4" w:space="0" w:color="E2E8F0"/>
-              <w:left w:val="none"/>
-              <w:right w:val="none"/>
-            </w:tcBorders>
-            <w:vAlign w:val="center"/>
-          </w:tcPr>
-          <w:p>
-            <w:pPr>
-              <w:jc w:val="left"/>
-            </w:pPr>
-            <w:r>
-              <w:rPr>
-                <w:color w:val="2D3748"/>
-                <w:sz w:val="17"/>
-              </w:rPr>
-              <w:t>Chef d'Agence</w:t>
             </w:r>
           </w:p>
         </w:tc>
@@ -908,189 +548,116 @@
         <w:tc>
           <w:tcPr>
             <w:tcW w:type="dxa" w:w="576"/>
-            <w:shd w:fill="F7FAFC"/>
-            <w:tcMar>
-              <w:top w:w="100" w:type="dxa"/>
-              <w:bottom w:w="100" w:type="dxa"/>
-              <w:left w:w="100" w:type="dxa"/>
-              <w:right w:w="100" w:type="dxa"/>
-            </w:tcMar>
-            <w:tcBorders>
-              <w:top w:val="single" w:sz="4" w:space="0" w:color="E2E8F0"/>
-              <w:bottom w:val="single" w:sz="4" w:space="0" w:color="E2E8F0"/>
-              <w:left w:val="none"/>
-              <w:right w:val="none"/>
-            </w:tcBorders>
+            <w:shd w:fill="F8FAFC"/>
             <w:vAlign w:val="center"/>
           </w:tcPr>
           <w:p>
             <w:pPr>
+              <w:spacing w:before="60" w:after="60"/>
               <w:jc w:val="center"/>
             </w:pPr>
             <w:r>
               <w:rPr>
                 <w:b/>
-                <w:color w:val="718096"/>
                 <w:sz w:val="17"/>
               </w:rPr>
-              <w:t>04</w:t>
+              <w:t>4</w:t>
             </w:r>
           </w:p>
         </w:tc>
         <w:tc>
           <w:tcPr>
-            <w:tcW w:type="dxa" w:w="2448"/>
-            <w:shd w:fill="F7FAFC"/>
-            <w:tcMar>
-              <w:top w:w="100" w:type="dxa"/>
-              <w:bottom w:w="100" w:type="dxa"/>
-              <w:left w:w="100" w:type="dxa"/>
-              <w:right w:w="100" w:type="dxa"/>
-            </w:tcMar>
-            <w:tcBorders>
-              <w:top w:val="single" w:sz="4" w:space="0" w:color="E2E8F0"/>
-              <w:bottom w:val="single" w:sz="4" w:space="0" w:color="E2E8F0"/>
-              <w:left w:val="none"/>
-              <w:right w:val="none"/>
-            </w:tcBorders>
+            <w:tcW w:type="dxa" w:w="2160"/>
+            <w:shd w:fill="F8FAFC"/>
             <w:vAlign w:val="center"/>
           </w:tcPr>
           <w:p>
             <w:pPr>
-              <w:jc w:val="left"/>
+              <w:spacing w:before="60" w:after="60"/>
             </w:pPr>
             <w:r>
               <w:rPr>
                 <w:b/>
-                <w:color w:val="1A365D"/>
+                <w:color w:val="0F172A"/>
                 <w:sz w:val="17"/>
               </w:rPr>
-              <w:t>KOUAME YVETTE</w:t>
+              <w:t>KOUAME Yvette</w:t>
             </w:r>
           </w:p>
         </w:tc>
         <w:tc>
           <w:tcPr>
-            <w:tcW w:type="dxa" w:w="2736"/>
-            <w:shd w:fill="F7FAFC"/>
-            <w:tcMar>
-              <w:top w:w="100" w:type="dxa"/>
-              <w:bottom w:w="100" w:type="dxa"/>
-              <w:left w:w="100" w:type="dxa"/>
-              <w:right w:w="100" w:type="dxa"/>
-            </w:tcMar>
-            <w:tcBorders>
-              <w:top w:val="single" w:sz="4" w:space="0" w:color="E2E8F0"/>
-              <w:bottom w:val="single" w:sz="4" w:space="0" w:color="E2E8F0"/>
-              <w:left w:val="none"/>
-              <w:right w:val="none"/>
-            </w:tcBorders>
+            <w:tcW w:type="dxa" w:w="2592"/>
+            <w:shd w:fill="F8FAFC"/>
             <w:vAlign w:val="center"/>
           </w:tcPr>
           <w:p>
             <w:pPr>
-              <w:jc w:val="left"/>
+              <w:spacing w:before="60" w:after="60"/>
             </w:pPr>
             <w:r>
               <w:rPr>
-                <w:color w:val="2B6CB0"/>
+                <w:color w:val="0284C7"/>
                 <w:sz w:val="17"/>
               </w:rPr>
-              <w:t>yvette.kouame@labelleporte.ci</w:t>
+              <w:t>kouame.yvette@labelleporte.ci</w:t>
+            </w:r>
+          </w:p>
+        </w:tc>
+        <w:tc>
+          <w:tcPr>
+            <w:tcW w:type="dxa" w:w="1872"/>
+            <w:shd w:fill="F8FAFC"/>
+            <w:vAlign w:val="center"/>
+          </w:tcPr>
+          <w:p>
+            <w:pPr>
+              <w:spacing w:before="60" w:after="60"/>
+            </w:pPr>
+            <w:r>
+              <w:rPr>
+                <w:sz w:val="17"/>
+              </w:rPr>
+              <w:t>AGENT DE SAISIE</w:t>
+            </w:r>
+          </w:p>
+        </w:tc>
+        <w:tc>
+          <w:tcPr>
+            <w:tcW w:type="dxa" w:w="1728"/>
+            <w:shd w:fill="F8FAFC"/>
+            <w:vAlign w:val="center"/>
+          </w:tcPr>
+          <w:p>
+            <w:pPr>
+              <w:spacing w:before="60" w:after="60"/>
+            </w:pPr>
+            <w:r>
+              <w:rPr>
+                <w:sz w:val="17"/>
+              </w:rPr>
+              <w:t>Agence Abobo Dokui</w:t>
             </w:r>
           </w:p>
         </w:tc>
         <w:tc>
           <w:tcPr>
             <w:tcW w:type="dxa" w:w="1296"/>
-            <w:shd w:fill="F7FAFC"/>
-            <w:tcMar>
-              <w:top w:w="100" w:type="dxa"/>
-              <w:bottom w:w="100" w:type="dxa"/>
-              <w:left w:w="100" w:type="dxa"/>
-              <w:right w:w="100" w:type="dxa"/>
-            </w:tcMar>
-            <w:tcBorders>
-              <w:top w:val="single" w:sz="4" w:space="0" w:color="E2E8F0"/>
-              <w:bottom w:val="single" w:sz="4" w:space="0" w:color="E2E8F0"/>
-              <w:left w:val="none"/>
-              <w:right w:val="none"/>
-            </w:tcBorders>
+            <w:shd w:fill="F8FAFC"/>
             <w:vAlign w:val="center"/>
           </w:tcPr>
           <w:p>
             <w:pPr>
+              <w:spacing w:before="60" w:after="60"/>
               <w:jc w:val="center"/>
             </w:pPr>
             <w:r>
               <w:rPr>
                 <w:b/>
-                <w:color w:val="C53030"/>
+                <w:color w:val="B91C1C"/>
                 <w:sz w:val="17"/>
               </w:rPr>
               <w:t>lbp2026</w:t>
-            </w:r>
-          </w:p>
-        </w:tc>
-        <w:tc>
-          <w:tcPr>
-            <w:tcW w:type="dxa" w:w="1584"/>
-            <w:shd w:fill="F7FAFC"/>
-            <w:tcMar>
-              <w:top w:w="100" w:type="dxa"/>
-              <w:bottom w:w="100" w:type="dxa"/>
-              <w:left w:w="100" w:type="dxa"/>
-              <w:right w:w="100" w:type="dxa"/>
-            </w:tcMar>
-            <w:tcBorders>
-              <w:top w:val="single" w:sz="4" w:space="0" w:color="E2E8F0"/>
-              <w:bottom w:val="single" w:sz="4" w:space="0" w:color="E2E8F0"/>
-              <w:left w:val="none"/>
-              <w:right w:val="none"/>
-            </w:tcBorders>
-            <w:vAlign w:val="center"/>
-          </w:tcPr>
-          <w:p>
-            <w:pPr>
-              <w:jc w:val="left"/>
-            </w:pPr>
-            <w:r>
-              <w:rPr>
-                <w:color w:val="2D3748"/>
-                <w:sz w:val="17"/>
-              </w:rPr>
-              <w:t>Agence Dokui</w:t>
-            </w:r>
-          </w:p>
-        </w:tc>
-        <w:tc>
-          <w:tcPr>
-            <w:tcW w:type="dxa" w:w="1584"/>
-            <w:shd w:fill="F7FAFC"/>
-            <w:tcMar>
-              <w:top w:w="100" w:type="dxa"/>
-              <w:bottom w:w="100" w:type="dxa"/>
-              <w:left w:w="100" w:type="dxa"/>
-              <w:right w:w="100" w:type="dxa"/>
-            </w:tcMar>
-            <w:tcBorders>
-              <w:top w:val="single" w:sz="4" w:space="0" w:color="E2E8F0"/>
-              <w:bottom w:val="single" w:sz="4" w:space="0" w:color="E2E8F0"/>
-              <w:left w:val="none"/>
-              <w:right w:val="none"/>
-            </w:tcBorders>
-            <w:vAlign w:val="center"/>
-          </w:tcPr>
-          <w:p>
-            <w:pPr>
-              <w:jc w:val="left"/>
-            </w:pPr>
-            <w:r>
-              <w:rPr>
-                <w:color w:val="2D3748"/>
-                <w:sz w:val="17"/>
-              </w:rPr>
-              <w:t>Agent de Saisie</w:t>
             </w:r>
           </w:p>
         </w:tc>
@@ -1100,60 +667,36 @@
           <w:tcPr>
             <w:tcW w:type="dxa" w:w="576"/>
             <w:shd w:fill="FFFFFF"/>
-            <w:tcMar>
-              <w:top w:w="100" w:type="dxa"/>
-              <w:bottom w:w="100" w:type="dxa"/>
-              <w:left w:w="100" w:type="dxa"/>
-              <w:right w:w="100" w:type="dxa"/>
-            </w:tcMar>
-            <w:tcBorders>
-              <w:top w:val="single" w:sz="4" w:space="0" w:color="E2E8F0"/>
-              <w:bottom w:val="single" w:sz="4" w:space="0" w:color="E2E8F0"/>
-              <w:left w:val="none"/>
-              <w:right w:val="none"/>
-            </w:tcBorders>
             <w:vAlign w:val="center"/>
           </w:tcPr>
           <w:p>
             <w:pPr>
+              <w:spacing w:before="60" w:after="60"/>
               <w:jc w:val="center"/>
             </w:pPr>
             <w:r>
               <w:rPr>
                 <w:b/>
-                <w:color w:val="718096"/>
                 <w:sz w:val="17"/>
               </w:rPr>
-              <w:t>05</w:t>
+              <w:t>5</w:t>
             </w:r>
           </w:p>
         </w:tc>
         <w:tc>
           <w:tcPr>
-            <w:tcW w:type="dxa" w:w="2448"/>
+            <w:tcW w:type="dxa" w:w="2160"/>
             <w:shd w:fill="FFFFFF"/>
-            <w:tcMar>
-              <w:top w:w="100" w:type="dxa"/>
-              <w:bottom w:w="100" w:type="dxa"/>
-              <w:left w:w="100" w:type="dxa"/>
-              <w:right w:w="100" w:type="dxa"/>
-            </w:tcMar>
-            <w:tcBorders>
-              <w:top w:val="single" w:sz="4" w:space="0" w:color="E2E8F0"/>
-              <w:bottom w:val="single" w:sz="4" w:space="0" w:color="E2E8F0"/>
-              <w:left w:val="none"/>
-              <w:right w:val="none"/>
-            </w:tcBorders>
             <w:vAlign w:val="center"/>
           </w:tcPr>
           <w:p>
             <w:pPr>
-              <w:jc w:val="left"/>
+              <w:spacing w:before="60" w:after="60"/>
             </w:pPr>
             <w:r>
               <w:rPr>
                 <w:b/>
-                <w:color w:val="1A365D"/>
+                <w:color w:val="0F172A"/>
                 <w:sz w:val="17"/>
               </w:rPr>
               <w:t>KOLI KONAN ANICET</w:t>
@@ -1162,32 +705,56 @@
         </w:tc>
         <w:tc>
           <w:tcPr>
-            <w:tcW w:type="dxa" w:w="2736"/>
+            <w:tcW w:type="dxa" w:w="2592"/>
             <w:shd w:fill="FFFFFF"/>
-            <w:tcMar>
-              <w:top w:w="100" w:type="dxa"/>
-              <w:bottom w:w="100" w:type="dxa"/>
-              <w:left w:w="100" w:type="dxa"/>
-              <w:right w:w="100" w:type="dxa"/>
-            </w:tcMar>
-            <w:tcBorders>
-              <w:top w:val="single" w:sz="4" w:space="0" w:color="E2E8F0"/>
-              <w:bottom w:val="single" w:sz="4" w:space="0" w:color="E2E8F0"/>
-              <w:left w:val="none"/>
-              <w:right w:val="none"/>
-            </w:tcBorders>
             <w:vAlign w:val="center"/>
           </w:tcPr>
           <w:p>
             <w:pPr>
-              <w:jc w:val="left"/>
+              <w:spacing w:before="60" w:after="60"/>
             </w:pPr>
             <w:r>
               <w:rPr>
-                <w:color w:val="2B6CB0"/>
+                <w:color w:val="0284C7"/>
                 <w:sz w:val="17"/>
               </w:rPr>
-              <w:t>anicet.koli@labelleporte.ci</w:t>
+              <w:t>anicet.konan@labelleporte.ci</w:t>
+            </w:r>
+          </w:p>
+        </w:tc>
+        <w:tc>
+          <w:tcPr>
+            <w:tcW w:type="dxa" w:w="1872"/>
+            <w:shd w:fill="FFFFFF"/>
+            <w:vAlign w:val="center"/>
+          </w:tcPr>
+          <w:p>
+            <w:pPr>
+              <w:spacing w:before="60" w:after="60"/>
+            </w:pPr>
+            <w:r>
+              <w:rPr>
+                <w:sz w:val="17"/>
+              </w:rPr>
+              <w:t>AGENT DE SAISIE</w:t>
+            </w:r>
+          </w:p>
+        </w:tc>
+        <w:tc>
+          <w:tcPr>
+            <w:tcW w:type="dxa" w:w="1728"/>
+            <w:shd w:fill="FFFFFF"/>
+            <w:vAlign w:val="center"/>
+          </w:tcPr>
+          <w:p>
+            <w:pPr>
+              <w:spacing w:before="60" w:after="60"/>
+            </w:pPr>
+            <w:r>
+              <w:rPr>
+                <w:sz w:val="17"/>
+              </w:rPr>
+              <w:t>Agence Abobo Dokui</w:t>
             </w:r>
           </w:p>
         </w:tc>
@@ -1195,93 +762,20 @@
           <w:tcPr>
             <w:tcW w:type="dxa" w:w="1296"/>
             <w:shd w:fill="FFFFFF"/>
-            <w:tcMar>
-              <w:top w:w="100" w:type="dxa"/>
-              <w:bottom w:w="100" w:type="dxa"/>
-              <w:left w:w="100" w:type="dxa"/>
-              <w:right w:w="100" w:type="dxa"/>
-            </w:tcMar>
-            <w:tcBorders>
-              <w:top w:val="single" w:sz="4" w:space="0" w:color="E2E8F0"/>
-              <w:bottom w:val="single" w:sz="4" w:space="0" w:color="E2E8F0"/>
-              <w:left w:val="none"/>
-              <w:right w:val="none"/>
-            </w:tcBorders>
             <w:vAlign w:val="center"/>
           </w:tcPr>
           <w:p>
             <w:pPr>
+              <w:spacing w:before="60" w:after="60"/>
               <w:jc w:val="center"/>
             </w:pPr>
             <w:r>
               <w:rPr>
                 <w:b/>
-                <w:color w:val="C53030"/>
+                <w:color w:val="B91C1C"/>
                 <w:sz w:val="17"/>
               </w:rPr>
               <w:t>lbp2026</w:t>
-            </w:r>
-          </w:p>
-        </w:tc>
-        <w:tc>
-          <w:tcPr>
-            <w:tcW w:type="dxa" w:w="1584"/>
-            <w:shd w:fill="FFFFFF"/>
-            <w:tcMar>
-              <w:top w:w="100" w:type="dxa"/>
-              <w:bottom w:w="100" w:type="dxa"/>
-              <w:left w:w="100" w:type="dxa"/>
-              <w:right w:w="100" w:type="dxa"/>
-            </w:tcMar>
-            <w:tcBorders>
-              <w:top w:val="single" w:sz="4" w:space="0" w:color="E2E8F0"/>
-              <w:bottom w:val="single" w:sz="4" w:space="0" w:color="E2E8F0"/>
-              <w:left w:val="none"/>
-              <w:right w:val="none"/>
-            </w:tcBorders>
-            <w:vAlign w:val="center"/>
-          </w:tcPr>
-          <w:p>
-            <w:pPr>
-              <w:jc w:val="left"/>
-            </w:pPr>
-            <w:r>
-              <w:rPr>
-                <w:color w:val="2D3748"/>
-                <w:sz w:val="17"/>
-              </w:rPr>
-              <w:t>Agence Dokui</w:t>
-            </w:r>
-          </w:p>
-        </w:tc>
-        <w:tc>
-          <w:tcPr>
-            <w:tcW w:type="dxa" w:w="1584"/>
-            <w:shd w:fill="FFFFFF"/>
-            <w:tcMar>
-              <w:top w:w="100" w:type="dxa"/>
-              <w:bottom w:w="100" w:type="dxa"/>
-              <w:left w:w="100" w:type="dxa"/>
-              <w:right w:w="100" w:type="dxa"/>
-            </w:tcMar>
-            <w:tcBorders>
-              <w:top w:val="single" w:sz="4" w:space="0" w:color="E2E8F0"/>
-              <w:bottom w:val="single" w:sz="4" w:space="0" w:color="E2E8F0"/>
-              <w:left w:val="none"/>
-              <w:right w:val="none"/>
-            </w:tcBorders>
-            <w:vAlign w:val="center"/>
-          </w:tcPr>
-          <w:p>
-            <w:pPr>
-              <w:jc w:val="left"/>
-            </w:pPr>
-            <w:r>
-              <w:rPr>
-                <w:color w:val="2D3748"/>
-                <w:sz w:val="17"/>
-              </w:rPr>
-              <w:t>Agent de Saisie</w:t>
             </w:r>
           </w:p>
         </w:tc>
@@ -1290,61 +784,37 @@
         <w:tc>
           <w:tcPr>
             <w:tcW w:type="dxa" w:w="576"/>
-            <w:shd w:fill="F7FAFC"/>
-            <w:tcMar>
-              <w:top w:w="100" w:type="dxa"/>
-              <w:bottom w:w="100" w:type="dxa"/>
-              <w:left w:w="100" w:type="dxa"/>
-              <w:right w:w="100" w:type="dxa"/>
-            </w:tcMar>
-            <w:tcBorders>
-              <w:top w:val="single" w:sz="4" w:space="0" w:color="E2E8F0"/>
-              <w:bottom w:val="single" w:sz="4" w:space="0" w:color="E2E8F0"/>
-              <w:left w:val="none"/>
-              <w:right w:val="none"/>
-            </w:tcBorders>
+            <w:shd w:fill="F8FAFC"/>
             <w:vAlign w:val="center"/>
           </w:tcPr>
           <w:p>
             <w:pPr>
+              <w:spacing w:before="60" w:after="60"/>
               <w:jc w:val="center"/>
             </w:pPr>
             <w:r>
               <w:rPr>
                 <w:b/>
-                <w:color w:val="718096"/>
                 <w:sz w:val="17"/>
               </w:rPr>
-              <w:t>06</w:t>
+              <w:t>6</w:t>
             </w:r>
           </w:p>
         </w:tc>
         <w:tc>
           <w:tcPr>
-            <w:tcW w:type="dxa" w:w="2448"/>
-            <w:shd w:fill="F7FAFC"/>
-            <w:tcMar>
-              <w:top w:w="100" w:type="dxa"/>
-              <w:bottom w:w="100" w:type="dxa"/>
-              <w:left w:w="100" w:type="dxa"/>
-              <w:right w:w="100" w:type="dxa"/>
-            </w:tcMar>
-            <w:tcBorders>
-              <w:top w:val="single" w:sz="4" w:space="0" w:color="E2E8F0"/>
-              <w:bottom w:val="single" w:sz="4" w:space="0" w:color="E2E8F0"/>
-              <w:left w:val="none"/>
-              <w:right w:val="none"/>
-            </w:tcBorders>
+            <w:tcW w:type="dxa" w:w="2160"/>
+            <w:shd w:fill="F8FAFC"/>
             <w:vAlign w:val="center"/>
           </w:tcPr>
           <w:p>
             <w:pPr>
-              <w:jc w:val="left"/>
+              <w:spacing w:before="60" w:after="60"/>
             </w:pPr>
             <w:r>
               <w:rPr>
                 <w:b/>
-                <w:color w:val="1A365D"/>
+                <w:color w:val="0F172A"/>
                 <w:sz w:val="17"/>
               </w:rPr>
               <w:t>Mme AGBADAN (Carine Abou)</w:t>
@@ -1353,29 +823,17 @@
         </w:tc>
         <w:tc>
           <w:tcPr>
-            <w:tcW w:type="dxa" w:w="2736"/>
-            <w:shd w:fill="F7FAFC"/>
-            <w:tcMar>
-              <w:top w:w="100" w:type="dxa"/>
-              <w:bottom w:w="100" w:type="dxa"/>
-              <w:left w:w="100" w:type="dxa"/>
-              <w:right w:w="100" w:type="dxa"/>
-            </w:tcMar>
-            <w:tcBorders>
-              <w:top w:val="single" w:sz="4" w:space="0" w:color="E2E8F0"/>
-              <w:bottom w:val="single" w:sz="4" w:space="0" w:color="E2E8F0"/>
-              <w:left w:val="none"/>
-              <w:right w:val="none"/>
-            </w:tcBorders>
+            <w:tcW w:type="dxa" w:w="2592"/>
+            <w:shd w:fill="F8FAFC"/>
             <w:vAlign w:val="center"/>
           </w:tcPr>
           <w:p>
             <w:pPr>
-              <w:jc w:val="left"/>
+              <w:spacing w:before="60" w:after="60"/>
             </w:pPr>
             <w:r>
               <w:rPr>
-                <w:color w:val="2B6CB0"/>
+                <w:color w:val="0284C7"/>
                 <w:sz w:val="17"/>
               </w:rPr>
               <w:t>carine.abou@labelleporte.ci</w:t>
@@ -1384,95 +842,58 @@
         </w:tc>
         <w:tc>
           <w:tcPr>
-            <w:tcW w:type="dxa" w:w="1296"/>
-            <w:shd w:fill="F7FAFC"/>
-            <w:tcMar>
-              <w:top w:w="100" w:type="dxa"/>
-              <w:bottom w:w="100" w:type="dxa"/>
-              <w:left w:w="100" w:type="dxa"/>
-              <w:right w:w="100" w:type="dxa"/>
-            </w:tcMar>
-            <w:tcBorders>
-              <w:top w:val="single" w:sz="4" w:space="0" w:color="E2E8F0"/>
-              <w:bottom w:val="single" w:sz="4" w:space="0" w:color="E2E8F0"/>
-              <w:left w:val="none"/>
-              <w:right w:val="none"/>
-            </w:tcBorders>
+            <w:tcW w:type="dxa" w:w="1872"/>
+            <w:shd w:fill="F8FAFC"/>
             <w:vAlign w:val="center"/>
           </w:tcPr>
           <w:p>
             <w:pPr>
+              <w:spacing w:before="60" w:after="60"/>
+            </w:pPr>
+            <w:r>
+              <w:rPr>
+                <w:sz w:val="17"/>
+              </w:rPr>
+              <w:t>CAISSIERE PRINCIPALE &amp; CAISSIERE DOKUI</w:t>
+            </w:r>
+          </w:p>
+        </w:tc>
+        <w:tc>
+          <w:tcPr>
+            <w:tcW w:type="dxa" w:w="1728"/>
+            <w:shd w:fill="F8FAFC"/>
+            <w:vAlign w:val="center"/>
+          </w:tcPr>
+          <w:p>
+            <w:pPr>
+              <w:spacing w:before="60" w:after="60"/>
+            </w:pPr>
+            <w:r>
+              <w:rPr>
+                <w:sz w:val="17"/>
+              </w:rPr>
+              <w:t>Agence Abobo Dokui</w:t>
+            </w:r>
+          </w:p>
+        </w:tc>
+        <w:tc>
+          <w:tcPr>
+            <w:tcW w:type="dxa" w:w="1296"/>
+            <w:shd w:fill="F8FAFC"/>
+            <w:vAlign w:val="center"/>
+          </w:tcPr>
+          <w:p>
+            <w:pPr>
+              <w:spacing w:before="60" w:after="60"/>
               <w:jc w:val="center"/>
             </w:pPr>
             <w:r>
               <w:rPr>
                 <w:b/>
-                <w:color w:val="C53030"/>
+                <w:color w:val="B91C1C"/>
                 <w:sz w:val="17"/>
               </w:rPr>
               <w:t>lbp2026</w:t>
-            </w:r>
-          </w:p>
-        </w:tc>
-        <w:tc>
-          <w:tcPr>
-            <w:tcW w:type="dxa" w:w="1584"/>
-            <w:shd w:fill="F7FAFC"/>
-            <w:tcMar>
-              <w:top w:w="100" w:type="dxa"/>
-              <w:bottom w:w="100" w:type="dxa"/>
-              <w:left w:w="100" w:type="dxa"/>
-              <w:right w:w="100" w:type="dxa"/>
-            </w:tcMar>
-            <w:tcBorders>
-              <w:top w:val="single" w:sz="4" w:space="0" w:color="E2E8F0"/>
-              <w:bottom w:val="single" w:sz="4" w:space="0" w:color="E2E8F0"/>
-              <w:left w:val="none"/>
-              <w:right w:val="none"/>
-            </w:tcBorders>
-            <w:vAlign w:val="center"/>
-          </w:tcPr>
-          <w:p>
-            <w:pPr>
-              <w:jc w:val="left"/>
-            </w:pPr>
-            <w:r>
-              <w:rPr>
-                <w:color w:val="2D3748"/>
-                <w:sz w:val="17"/>
-              </w:rPr>
-              <w:t>Agence Dokui</w:t>
-            </w:r>
-          </w:p>
-        </w:tc>
-        <w:tc>
-          <w:tcPr>
-            <w:tcW w:type="dxa" w:w="1584"/>
-            <w:shd w:fill="F7FAFC"/>
-            <w:tcMar>
-              <w:top w:w="100" w:type="dxa"/>
-              <w:bottom w:w="100" w:type="dxa"/>
-              <w:left w:w="100" w:type="dxa"/>
-              <w:right w:w="100" w:type="dxa"/>
-            </w:tcMar>
-            <w:tcBorders>
-              <w:top w:val="single" w:sz="4" w:space="0" w:color="E2E8F0"/>
-              <w:bottom w:val="single" w:sz="4" w:space="0" w:color="E2E8F0"/>
-              <w:left w:val="none"/>
-              <w:right w:val="none"/>
-            </w:tcBorders>
-            <w:vAlign w:val="center"/>
-          </w:tcPr>
-          <w:p>
-            <w:pPr>
-              <w:jc w:val="left"/>
-            </w:pPr>
-            <w:r>
-              <w:rPr>
-                <w:color w:val="2D3748"/>
-                <w:sz w:val="17"/>
-              </w:rPr>
-              <w:t>Caissière</w:t>
             </w:r>
           </w:p>
         </w:tc>
@@ -1482,60 +903,36 @@
           <w:tcPr>
             <w:tcW w:type="dxa" w:w="576"/>
             <w:shd w:fill="FFFFFF"/>
-            <w:tcMar>
-              <w:top w:w="100" w:type="dxa"/>
-              <w:bottom w:w="100" w:type="dxa"/>
-              <w:left w:w="100" w:type="dxa"/>
-              <w:right w:w="100" w:type="dxa"/>
-            </w:tcMar>
-            <w:tcBorders>
-              <w:top w:val="single" w:sz="4" w:space="0" w:color="E2E8F0"/>
-              <w:bottom w:val="single" w:sz="4" w:space="0" w:color="E2E8F0"/>
-              <w:left w:val="none"/>
-              <w:right w:val="none"/>
-            </w:tcBorders>
             <w:vAlign w:val="center"/>
           </w:tcPr>
           <w:p>
             <w:pPr>
+              <w:spacing w:before="60" w:after="60"/>
               <w:jc w:val="center"/>
             </w:pPr>
             <w:r>
               <w:rPr>
                 <w:b/>
-                <w:color w:val="718096"/>
                 <w:sz w:val="17"/>
               </w:rPr>
-              <w:t>07</w:t>
+              <w:t>7</w:t>
             </w:r>
           </w:p>
         </w:tc>
         <w:tc>
           <w:tcPr>
-            <w:tcW w:type="dxa" w:w="2448"/>
+            <w:tcW w:type="dxa" w:w="2160"/>
             <w:shd w:fill="FFFFFF"/>
-            <w:tcMar>
-              <w:top w:w="100" w:type="dxa"/>
-              <w:bottom w:w="100" w:type="dxa"/>
-              <w:left w:w="100" w:type="dxa"/>
-              <w:right w:w="100" w:type="dxa"/>
-            </w:tcMar>
-            <w:tcBorders>
-              <w:top w:val="single" w:sz="4" w:space="0" w:color="E2E8F0"/>
-              <w:bottom w:val="single" w:sz="4" w:space="0" w:color="E2E8F0"/>
-              <w:left w:val="none"/>
-              <w:right w:val="none"/>
-            </w:tcBorders>
             <w:vAlign w:val="center"/>
           </w:tcPr>
           <w:p>
             <w:pPr>
-              <w:jc w:val="left"/>
+              <w:spacing w:before="60" w:after="60"/>
             </w:pPr>
             <w:r>
               <w:rPr>
                 <w:b/>
-                <w:color w:val="1A365D"/>
+                <w:color w:val="0F172A"/>
                 <w:sz w:val="17"/>
               </w:rPr>
               <w:t>ABASSI WILFRIED</w:t>
@@ -1544,29 +941,17 @@
         </w:tc>
         <w:tc>
           <w:tcPr>
-            <w:tcW w:type="dxa" w:w="2736"/>
+            <w:tcW w:type="dxa" w:w="2592"/>
             <w:shd w:fill="FFFFFF"/>
-            <w:tcMar>
-              <w:top w:w="100" w:type="dxa"/>
-              <w:bottom w:w="100" w:type="dxa"/>
-              <w:left w:w="100" w:type="dxa"/>
-              <w:right w:w="100" w:type="dxa"/>
-            </w:tcMar>
-            <w:tcBorders>
-              <w:top w:val="single" w:sz="4" w:space="0" w:color="E2E8F0"/>
-              <w:bottom w:val="single" w:sz="4" w:space="0" w:color="E2E8F0"/>
-              <w:left w:val="none"/>
-              <w:right w:val="none"/>
-            </w:tcBorders>
             <w:vAlign w:val="center"/>
           </w:tcPr>
           <w:p>
             <w:pPr>
-              <w:jc w:val="left"/>
+              <w:spacing w:before="60" w:after="60"/>
             </w:pPr>
             <w:r>
               <w:rPr>
-                <w:color w:val="2B6CB0"/>
+                <w:color w:val="0284C7"/>
                 <w:sz w:val="17"/>
               </w:rPr>
               <w:t>wilfried.abassi@labelleporte.ci</w:t>
@@ -1575,95 +960,58 @@
         </w:tc>
         <w:tc>
           <w:tcPr>
-            <w:tcW w:type="dxa" w:w="1296"/>
+            <w:tcW w:type="dxa" w:w="1872"/>
             <w:shd w:fill="FFFFFF"/>
-            <w:tcMar>
-              <w:top w:w="100" w:type="dxa"/>
-              <w:bottom w:w="100" w:type="dxa"/>
-              <w:left w:w="100" w:type="dxa"/>
-              <w:right w:w="100" w:type="dxa"/>
-            </w:tcMar>
-            <w:tcBorders>
-              <w:top w:val="single" w:sz="4" w:space="0" w:color="E2E8F0"/>
-              <w:bottom w:val="single" w:sz="4" w:space="0" w:color="E2E8F0"/>
-              <w:left w:val="none"/>
-              <w:right w:val="none"/>
-            </w:tcBorders>
             <w:vAlign w:val="center"/>
           </w:tcPr>
           <w:p>
             <w:pPr>
+              <w:spacing w:before="60" w:after="60"/>
+            </w:pPr>
+            <w:r>
+              <w:rPr>
+                <w:sz w:val="17"/>
+              </w:rPr>
+              <w:t>RESPONSABLE MARKETING &amp; CALL CENTER</w:t>
+            </w:r>
+          </w:p>
+        </w:tc>
+        <w:tc>
+          <w:tcPr>
+            <w:tcW w:type="dxa" w:w="1728"/>
+            <w:shd w:fill="FFFFFF"/>
+            <w:vAlign w:val="center"/>
+          </w:tcPr>
+          <w:p>
+            <w:pPr>
+              <w:spacing w:before="60" w:after="60"/>
+            </w:pPr>
+            <w:r>
+              <w:rPr>
+                <w:sz w:val="17"/>
+              </w:rPr>
+              <w:t>Toutes les agences</w:t>
+            </w:r>
+          </w:p>
+        </w:tc>
+        <w:tc>
+          <w:tcPr>
+            <w:tcW w:type="dxa" w:w="1296"/>
+            <w:shd w:fill="FFFFFF"/>
+            <w:vAlign w:val="center"/>
+          </w:tcPr>
+          <w:p>
+            <w:pPr>
+              <w:spacing w:before="60" w:after="60"/>
               <w:jc w:val="center"/>
             </w:pPr>
             <w:r>
               <w:rPr>
                 <w:b/>
-                <w:color w:val="C53030"/>
+                <w:color w:val="B91C1C"/>
                 <w:sz w:val="17"/>
               </w:rPr>
               <w:t>lbp2026</w:t>
-            </w:r>
-          </w:p>
-        </w:tc>
-        <w:tc>
-          <w:tcPr>
-            <w:tcW w:type="dxa" w:w="1584"/>
-            <w:shd w:fill="FFFFFF"/>
-            <w:tcMar>
-              <w:top w:w="100" w:type="dxa"/>
-              <w:bottom w:w="100" w:type="dxa"/>
-              <w:left w:w="100" w:type="dxa"/>
-              <w:right w:w="100" w:type="dxa"/>
-            </w:tcMar>
-            <w:tcBorders>
-              <w:top w:val="single" w:sz="4" w:space="0" w:color="E2E8F0"/>
-              <w:bottom w:val="single" w:sz="4" w:space="0" w:color="E2E8F0"/>
-              <w:left w:val="none"/>
-              <w:right w:val="none"/>
-            </w:tcBorders>
-            <w:vAlign w:val="center"/>
-          </w:tcPr>
-          <w:p>
-            <w:pPr>
-              <w:jc w:val="left"/>
-            </w:pPr>
-            <w:r>
-              <w:rPr>
-                <w:color w:val="2D3748"/>
-                <w:sz w:val="17"/>
-              </w:rPr>
-              <w:t>Siège Abidjan</w:t>
-            </w:r>
-          </w:p>
-        </w:tc>
-        <w:tc>
-          <w:tcPr>
-            <w:tcW w:type="dxa" w:w="1584"/>
-            <w:shd w:fill="FFFFFF"/>
-            <w:tcMar>
-              <w:top w:w="100" w:type="dxa"/>
-              <w:bottom w:w="100" w:type="dxa"/>
-              <w:left w:w="100" w:type="dxa"/>
-              <w:right w:w="100" w:type="dxa"/>
-            </w:tcMar>
-            <w:tcBorders>
-              <w:top w:val="single" w:sz="4" w:space="0" w:color="E2E8F0"/>
-              <w:bottom w:val="single" w:sz="4" w:space="0" w:color="E2E8F0"/>
-              <w:left w:val="none"/>
-              <w:right w:val="none"/>
-            </w:tcBorders>
-            <w:vAlign w:val="center"/>
-          </w:tcPr>
-          <w:p>
-            <w:pPr>
-              <w:jc w:val="left"/>
-            </w:pPr>
-            <w:r>
-              <w:rPr>
-                <w:color w:val="2D3748"/>
-                <w:sz w:val="17"/>
-              </w:rPr>
-              <w:t>Resp. Marketing &amp; Comm</w:t>
             </w:r>
           </w:p>
         </w:tc>
@@ -1672,61 +1020,37 @@
         <w:tc>
           <w:tcPr>
             <w:tcW w:type="dxa" w:w="576"/>
-            <w:shd w:fill="F7FAFC"/>
-            <w:tcMar>
-              <w:top w:w="100" w:type="dxa"/>
-              <w:bottom w:w="100" w:type="dxa"/>
-              <w:left w:w="100" w:type="dxa"/>
-              <w:right w:w="100" w:type="dxa"/>
-            </w:tcMar>
-            <w:tcBorders>
-              <w:top w:val="single" w:sz="4" w:space="0" w:color="E2E8F0"/>
-              <w:bottom w:val="single" w:sz="4" w:space="0" w:color="E2E8F0"/>
-              <w:left w:val="none"/>
-              <w:right w:val="none"/>
-            </w:tcBorders>
+            <w:shd w:fill="F8FAFC"/>
             <w:vAlign w:val="center"/>
           </w:tcPr>
           <w:p>
             <w:pPr>
+              <w:spacing w:before="60" w:after="60"/>
               <w:jc w:val="center"/>
             </w:pPr>
             <w:r>
               <w:rPr>
                 <w:b/>
-                <w:color w:val="718096"/>
                 <w:sz w:val="17"/>
               </w:rPr>
-              <w:t>08</w:t>
+              <w:t>8</w:t>
             </w:r>
           </w:p>
         </w:tc>
         <w:tc>
           <w:tcPr>
-            <w:tcW w:type="dxa" w:w="2448"/>
-            <w:shd w:fill="F7FAFC"/>
-            <w:tcMar>
-              <w:top w:w="100" w:type="dxa"/>
-              <w:bottom w:w="100" w:type="dxa"/>
-              <w:left w:w="100" w:type="dxa"/>
-              <w:right w:w="100" w:type="dxa"/>
-            </w:tcMar>
-            <w:tcBorders>
-              <w:top w:val="single" w:sz="4" w:space="0" w:color="E2E8F0"/>
-              <w:bottom w:val="single" w:sz="4" w:space="0" w:color="E2E8F0"/>
-              <w:left w:val="none"/>
-              <w:right w:val="none"/>
-            </w:tcBorders>
+            <w:tcW w:type="dxa" w:w="2160"/>
+            <w:shd w:fill="F8FAFC"/>
             <w:vAlign w:val="center"/>
           </w:tcPr>
           <w:p>
             <w:pPr>
-              <w:jc w:val="left"/>
+              <w:spacing w:before="60" w:after="60"/>
             </w:pPr>
             <w:r>
               <w:rPr>
                 <w:b/>
-                <w:color w:val="1A365D"/>
+                <w:color w:val="0F172A"/>
                 <w:sz w:val="17"/>
               </w:rPr>
               <w:t>LASSICI MARIAM</w:t>
@@ -1735,29 +1059,17 @@
         </w:tc>
         <w:tc>
           <w:tcPr>
-            <w:tcW w:type="dxa" w:w="2736"/>
-            <w:shd w:fill="F7FAFC"/>
-            <w:tcMar>
-              <w:top w:w="100" w:type="dxa"/>
-              <w:bottom w:w="100" w:type="dxa"/>
-              <w:left w:w="100" w:type="dxa"/>
-              <w:right w:w="100" w:type="dxa"/>
-            </w:tcMar>
-            <w:tcBorders>
-              <w:top w:val="single" w:sz="4" w:space="0" w:color="E2E8F0"/>
-              <w:bottom w:val="single" w:sz="4" w:space="0" w:color="E2E8F0"/>
-              <w:left w:val="none"/>
-              <w:right w:val="none"/>
-            </w:tcBorders>
+            <w:tcW w:type="dxa" w:w="2592"/>
+            <w:shd w:fill="F8FAFC"/>
             <w:vAlign w:val="center"/>
           </w:tcPr>
           <w:p>
             <w:pPr>
-              <w:jc w:val="left"/>
+              <w:spacing w:before="60" w:after="60"/>
             </w:pPr>
             <w:r>
               <w:rPr>
-                <w:color w:val="2B6CB0"/>
+                <w:color w:val="0284C7"/>
                 <w:sz w:val="17"/>
               </w:rPr>
               <w:t>mariam.lassici@labelleporte.ci</w:t>
@@ -1766,95 +1078,58 @@
         </w:tc>
         <w:tc>
           <w:tcPr>
-            <w:tcW w:type="dxa" w:w="1296"/>
-            <w:shd w:fill="F7FAFC"/>
-            <w:tcMar>
-              <w:top w:w="100" w:type="dxa"/>
-              <w:bottom w:w="100" w:type="dxa"/>
-              <w:left w:w="100" w:type="dxa"/>
-              <w:right w:w="100" w:type="dxa"/>
-            </w:tcMar>
-            <w:tcBorders>
-              <w:top w:val="single" w:sz="4" w:space="0" w:color="E2E8F0"/>
-              <w:bottom w:val="single" w:sz="4" w:space="0" w:color="E2E8F0"/>
-              <w:left w:val="none"/>
-              <w:right w:val="none"/>
-            </w:tcBorders>
+            <w:tcW w:type="dxa" w:w="1872"/>
+            <w:shd w:fill="F8FAFC"/>
             <w:vAlign w:val="center"/>
           </w:tcPr>
           <w:p>
             <w:pPr>
+              <w:spacing w:before="60" w:after="60"/>
+            </w:pPr>
+            <w:r>
+              <w:rPr>
+                <w:sz w:val="17"/>
+              </w:rPr>
+              <w:t>AGENT CALL CENTER</w:t>
+            </w:r>
+          </w:p>
+        </w:tc>
+        <w:tc>
+          <w:tcPr>
+            <w:tcW w:type="dxa" w:w="1728"/>
+            <w:shd w:fill="F8FAFC"/>
+            <w:vAlign w:val="center"/>
+          </w:tcPr>
+          <w:p>
+            <w:pPr>
+              <w:spacing w:before="60" w:after="60"/>
+            </w:pPr>
+            <w:r>
+              <w:rPr>
+                <w:sz w:val="17"/>
+              </w:rPr>
+              <w:t>Toutes les agences</w:t>
+            </w:r>
+          </w:p>
+        </w:tc>
+        <w:tc>
+          <w:tcPr>
+            <w:tcW w:type="dxa" w:w="1296"/>
+            <w:shd w:fill="F8FAFC"/>
+            <w:vAlign w:val="center"/>
+          </w:tcPr>
+          <w:p>
+            <w:pPr>
+              <w:spacing w:before="60" w:after="60"/>
               <w:jc w:val="center"/>
             </w:pPr>
             <w:r>
               <w:rPr>
                 <w:b/>
-                <w:color w:val="C53030"/>
+                <w:color w:val="B91C1C"/>
                 <w:sz w:val="17"/>
               </w:rPr>
               <w:t>lbp2026</w:t>
-            </w:r>
-          </w:p>
-        </w:tc>
-        <w:tc>
-          <w:tcPr>
-            <w:tcW w:type="dxa" w:w="1584"/>
-            <w:shd w:fill="F7FAFC"/>
-            <w:tcMar>
-              <w:top w:w="100" w:type="dxa"/>
-              <w:bottom w:w="100" w:type="dxa"/>
-              <w:left w:w="100" w:type="dxa"/>
-              <w:right w:w="100" w:type="dxa"/>
-            </w:tcMar>
-            <w:tcBorders>
-              <w:top w:val="single" w:sz="4" w:space="0" w:color="E2E8F0"/>
-              <w:bottom w:val="single" w:sz="4" w:space="0" w:color="E2E8F0"/>
-              <w:left w:val="none"/>
-              <w:right w:val="none"/>
-            </w:tcBorders>
-            <w:vAlign w:val="center"/>
-          </w:tcPr>
-          <w:p>
-            <w:pPr>
-              <w:jc w:val="left"/>
-            </w:pPr>
-            <w:r>
-              <w:rPr>
-                <w:color w:val="2D3748"/>
-                <w:sz w:val="17"/>
-              </w:rPr>
-              <w:t>Siège Abidjan</w:t>
-            </w:r>
-          </w:p>
-        </w:tc>
-        <w:tc>
-          <w:tcPr>
-            <w:tcW w:type="dxa" w:w="1584"/>
-            <w:shd w:fill="F7FAFC"/>
-            <w:tcMar>
-              <w:top w:w="100" w:type="dxa"/>
-              <w:bottom w:w="100" w:type="dxa"/>
-              <w:left w:w="100" w:type="dxa"/>
-              <w:right w:w="100" w:type="dxa"/>
-            </w:tcMar>
-            <w:tcBorders>
-              <w:top w:val="single" w:sz="4" w:space="0" w:color="E2E8F0"/>
-              <w:bottom w:val="single" w:sz="4" w:space="0" w:color="E2E8F0"/>
-              <w:left w:val="none"/>
-              <w:right w:val="none"/>
-            </w:tcBorders>
-            <w:vAlign w:val="center"/>
-          </w:tcPr>
-          <w:p>
-            <w:pPr>
-              <w:jc w:val="left"/>
-            </w:pPr>
-            <w:r>
-              <w:rPr>
-                <w:color w:val="2D3748"/>
-                <w:sz w:val="17"/>
-              </w:rPr>
-              <w:t>Agent Call Center</w:t>
             </w:r>
           </w:p>
         </w:tc>
@@ -1864,60 +1139,36 @@
           <w:tcPr>
             <w:tcW w:type="dxa" w:w="576"/>
             <w:shd w:fill="FFFFFF"/>
-            <w:tcMar>
-              <w:top w:w="100" w:type="dxa"/>
-              <w:bottom w:w="100" w:type="dxa"/>
-              <w:left w:w="100" w:type="dxa"/>
-              <w:right w:w="100" w:type="dxa"/>
-            </w:tcMar>
-            <w:tcBorders>
-              <w:top w:val="single" w:sz="4" w:space="0" w:color="E2E8F0"/>
-              <w:bottom w:val="single" w:sz="4" w:space="0" w:color="E2E8F0"/>
-              <w:left w:val="none"/>
-              <w:right w:val="none"/>
-            </w:tcBorders>
             <w:vAlign w:val="center"/>
           </w:tcPr>
           <w:p>
             <w:pPr>
+              <w:spacing w:before="60" w:after="60"/>
               <w:jc w:val="center"/>
             </w:pPr>
             <w:r>
               <w:rPr>
                 <w:b/>
-                <w:color w:val="718096"/>
                 <w:sz w:val="17"/>
               </w:rPr>
-              <w:t>09</w:t>
+              <w:t>9</w:t>
             </w:r>
           </w:p>
         </w:tc>
         <w:tc>
           <w:tcPr>
-            <w:tcW w:type="dxa" w:w="2448"/>
+            <w:tcW w:type="dxa" w:w="2160"/>
             <w:shd w:fill="FFFFFF"/>
-            <w:tcMar>
-              <w:top w:w="100" w:type="dxa"/>
-              <w:bottom w:w="100" w:type="dxa"/>
-              <w:left w:w="100" w:type="dxa"/>
-              <w:right w:w="100" w:type="dxa"/>
-            </w:tcMar>
-            <w:tcBorders>
-              <w:top w:val="single" w:sz="4" w:space="0" w:color="E2E8F0"/>
-              <w:bottom w:val="single" w:sz="4" w:space="0" w:color="E2E8F0"/>
-              <w:left w:val="none"/>
-              <w:right w:val="none"/>
-            </w:tcBorders>
             <w:vAlign w:val="center"/>
           </w:tcPr>
           <w:p>
             <w:pPr>
-              <w:jc w:val="left"/>
+              <w:spacing w:before="60" w:after="60"/>
             </w:pPr>
             <w:r>
               <w:rPr>
                 <w:b/>
-                <w:color w:val="1A365D"/>
+                <w:color w:val="0F172A"/>
                 <w:sz w:val="17"/>
               </w:rPr>
               <w:t>KOFFI MARQUEZ</w:t>
@@ -1926,29 +1177,17 @@
         </w:tc>
         <w:tc>
           <w:tcPr>
-            <w:tcW w:type="dxa" w:w="2736"/>
+            <w:tcW w:type="dxa" w:w="2592"/>
             <w:shd w:fill="FFFFFF"/>
-            <w:tcMar>
-              <w:top w:w="100" w:type="dxa"/>
-              <w:bottom w:w="100" w:type="dxa"/>
-              <w:left w:w="100" w:type="dxa"/>
-              <w:right w:w="100" w:type="dxa"/>
-            </w:tcMar>
-            <w:tcBorders>
-              <w:top w:val="single" w:sz="4" w:space="0" w:color="E2E8F0"/>
-              <w:bottom w:val="single" w:sz="4" w:space="0" w:color="E2E8F0"/>
-              <w:left w:val="none"/>
-              <w:right w:val="none"/>
-            </w:tcBorders>
             <w:vAlign w:val="center"/>
           </w:tcPr>
           <w:p>
             <w:pPr>
-              <w:jc w:val="left"/>
+              <w:spacing w:before="60" w:after="60"/>
             </w:pPr>
             <w:r>
               <w:rPr>
-                <w:color w:val="2B6CB0"/>
+                <w:color w:val="0284C7"/>
                 <w:sz w:val="17"/>
               </w:rPr>
               <w:t>marquez.koffi@labelleporte.ci</w:t>
@@ -1957,95 +1196,58 @@
         </w:tc>
         <w:tc>
           <w:tcPr>
-            <w:tcW w:type="dxa" w:w="1296"/>
+            <w:tcW w:type="dxa" w:w="1872"/>
             <w:shd w:fill="FFFFFF"/>
-            <w:tcMar>
-              <w:top w:w="100" w:type="dxa"/>
-              <w:bottom w:w="100" w:type="dxa"/>
-              <w:left w:w="100" w:type="dxa"/>
-              <w:right w:w="100" w:type="dxa"/>
-            </w:tcMar>
-            <w:tcBorders>
-              <w:top w:val="single" w:sz="4" w:space="0" w:color="E2E8F0"/>
-              <w:bottom w:val="single" w:sz="4" w:space="0" w:color="E2E8F0"/>
-              <w:left w:val="none"/>
-              <w:right w:val="none"/>
-            </w:tcBorders>
             <w:vAlign w:val="center"/>
           </w:tcPr>
           <w:p>
             <w:pPr>
+              <w:spacing w:before="60" w:after="60"/>
+            </w:pPr>
+            <w:r>
+              <w:rPr>
+                <w:sz w:val="17"/>
+              </w:rPr>
+              <w:t>CHEF D'AGENCE</w:t>
+            </w:r>
+          </w:p>
+        </w:tc>
+        <w:tc>
+          <w:tcPr>
+            <w:tcW w:type="dxa" w:w="1728"/>
+            <w:shd w:fill="FFFFFF"/>
+            <w:vAlign w:val="center"/>
+          </w:tcPr>
+          <w:p>
+            <w:pPr>
+              <w:spacing w:before="60" w:after="60"/>
+            </w:pPr>
+            <w:r>
+              <w:rPr>
+                <w:sz w:val="17"/>
+              </w:rPr>
+              <w:t>Aéroport Port-Bouët Fret</w:t>
+            </w:r>
+          </w:p>
+        </w:tc>
+        <w:tc>
+          <w:tcPr>
+            <w:tcW w:type="dxa" w:w="1296"/>
+            <w:shd w:fill="FFFFFF"/>
+            <w:vAlign w:val="center"/>
+          </w:tcPr>
+          <w:p>
+            <w:pPr>
+              <w:spacing w:before="60" w:after="60"/>
               <w:jc w:val="center"/>
             </w:pPr>
             <w:r>
               <w:rPr>
                 <w:b/>
-                <w:color w:val="C53030"/>
+                <w:color w:val="B91C1C"/>
                 <w:sz w:val="17"/>
               </w:rPr>
               <w:t>lbp2026</w:t>
-            </w:r>
-          </w:p>
-        </w:tc>
-        <w:tc>
-          <w:tcPr>
-            <w:tcW w:type="dxa" w:w="1584"/>
-            <w:shd w:fill="FFFFFF"/>
-            <w:tcMar>
-              <w:top w:w="100" w:type="dxa"/>
-              <w:bottom w:w="100" w:type="dxa"/>
-              <w:left w:w="100" w:type="dxa"/>
-              <w:right w:w="100" w:type="dxa"/>
-            </w:tcMar>
-            <w:tcBorders>
-              <w:top w:val="single" w:sz="4" w:space="0" w:color="E2E8F0"/>
-              <w:bottom w:val="single" w:sz="4" w:space="0" w:color="E2E8F0"/>
-              <w:left w:val="none"/>
-              <w:right w:val="none"/>
-            </w:tcBorders>
-            <w:vAlign w:val="center"/>
-          </w:tcPr>
-          <w:p>
-            <w:pPr>
-              <w:jc w:val="left"/>
-            </w:pPr>
-            <w:r>
-              <w:rPr>
-                <w:color w:val="2D3748"/>
-                <w:sz w:val="17"/>
-              </w:rPr>
-              <w:t>Aéroport Fret</w:t>
-            </w:r>
-          </w:p>
-        </w:tc>
-        <w:tc>
-          <w:tcPr>
-            <w:tcW w:type="dxa" w:w="1584"/>
-            <w:shd w:fill="FFFFFF"/>
-            <w:tcMar>
-              <w:top w:w="100" w:type="dxa"/>
-              <w:bottom w:w="100" w:type="dxa"/>
-              <w:left w:w="100" w:type="dxa"/>
-              <w:right w:w="100" w:type="dxa"/>
-            </w:tcMar>
-            <w:tcBorders>
-              <w:top w:val="single" w:sz="4" w:space="0" w:color="E2E8F0"/>
-              <w:bottom w:val="single" w:sz="4" w:space="0" w:color="E2E8F0"/>
-              <w:left w:val="none"/>
-              <w:right w:val="none"/>
-            </w:tcBorders>
-            <w:vAlign w:val="center"/>
-          </w:tcPr>
-          <w:p>
-            <w:pPr>
-              <w:jc w:val="left"/>
-            </w:pPr>
-            <w:r>
-              <w:rPr>
-                <w:color w:val="2D3748"/>
-                <w:sz w:val="17"/>
-              </w:rPr>
-              <w:t>Chef d'Agence</w:t>
             </w:r>
           </w:p>
         </w:tc>
@@ -2054,29 +1256,17 @@
         <w:tc>
           <w:tcPr>
             <w:tcW w:type="dxa" w:w="576"/>
-            <w:shd w:fill="F7FAFC"/>
-            <w:tcMar>
-              <w:top w:w="100" w:type="dxa"/>
-              <w:bottom w:w="100" w:type="dxa"/>
-              <w:left w:w="100" w:type="dxa"/>
-              <w:right w:w="100" w:type="dxa"/>
-            </w:tcMar>
-            <w:tcBorders>
-              <w:top w:val="single" w:sz="4" w:space="0" w:color="E2E8F0"/>
-              <w:bottom w:val="single" w:sz="4" w:space="0" w:color="E2E8F0"/>
-              <w:left w:val="none"/>
-              <w:right w:val="none"/>
-            </w:tcBorders>
+            <w:shd w:fill="F8FAFC"/>
             <w:vAlign w:val="center"/>
           </w:tcPr>
           <w:p>
             <w:pPr>
+              <w:spacing w:before="60" w:after="60"/>
               <w:jc w:val="center"/>
             </w:pPr>
             <w:r>
               <w:rPr>
                 <w:b/>
-                <w:color w:val="718096"/>
                 <w:sz w:val="17"/>
               </w:rPr>
               <w:t>10</w:t>
@@ -2085,30 +1275,18 @@
         </w:tc>
         <w:tc>
           <w:tcPr>
-            <w:tcW w:type="dxa" w:w="2448"/>
-            <w:shd w:fill="F7FAFC"/>
-            <w:tcMar>
-              <w:top w:w="100" w:type="dxa"/>
-              <w:bottom w:w="100" w:type="dxa"/>
-              <w:left w:w="100" w:type="dxa"/>
-              <w:right w:w="100" w:type="dxa"/>
-            </w:tcMar>
-            <w:tcBorders>
-              <w:top w:val="single" w:sz="4" w:space="0" w:color="E2E8F0"/>
-              <w:bottom w:val="single" w:sz="4" w:space="0" w:color="E2E8F0"/>
-              <w:left w:val="none"/>
-              <w:right w:val="none"/>
-            </w:tcBorders>
+            <w:tcW w:type="dxa" w:w="2160"/>
+            <w:shd w:fill="F8FAFC"/>
             <w:vAlign w:val="center"/>
           </w:tcPr>
           <w:p>
             <w:pPr>
-              <w:jc w:val="left"/>
+              <w:spacing w:before="60" w:after="60"/>
             </w:pPr>
             <w:r>
               <w:rPr>
                 <w:b/>
-                <w:color w:val="1A365D"/>
+                <w:color w:val="0F172A"/>
                 <w:sz w:val="17"/>
               </w:rPr>
               <w:t>ASSOMA ASSI JEAN EUDES</w:t>
@@ -2117,126 +1295,77 @@
         </w:tc>
         <w:tc>
           <w:tcPr>
-            <w:tcW w:type="dxa" w:w="2736"/>
-            <w:shd w:fill="F7FAFC"/>
-            <w:tcMar>
-              <w:top w:w="100" w:type="dxa"/>
-              <w:bottom w:w="100" w:type="dxa"/>
-              <w:left w:w="100" w:type="dxa"/>
-              <w:right w:w="100" w:type="dxa"/>
-            </w:tcMar>
-            <w:tcBorders>
-              <w:top w:val="single" w:sz="4" w:space="0" w:color="E2E8F0"/>
-              <w:bottom w:val="single" w:sz="4" w:space="0" w:color="E2E8F0"/>
-              <w:left w:val="none"/>
-              <w:right w:val="none"/>
-            </w:tcBorders>
+            <w:tcW w:type="dxa" w:w="2592"/>
+            <w:shd w:fill="F8FAFC"/>
             <w:vAlign w:val="center"/>
           </w:tcPr>
           <w:p>
             <w:pPr>
-              <w:jc w:val="left"/>
+              <w:spacing w:before="60" w:after="60"/>
             </w:pPr>
             <w:r>
               <w:rPr>
-                <w:color w:val="2B6CB0"/>
+                <w:color w:val="0284C7"/>
                 <w:sz w:val="17"/>
               </w:rPr>
-              <w:t>jeaneudes.assoma@labelleporte.ci</w:t>
+              <w:t>jean.eudes@labelleporte.ci</w:t>
+            </w:r>
+          </w:p>
+        </w:tc>
+        <w:tc>
+          <w:tcPr>
+            <w:tcW w:type="dxa" w:w="1872"/>
+            <w:shd w:fill="F8FAFC"/>
+            <w:vAlign w:val="center"/>
+          </w:tcPr>
+          <w:p>
+            <w:pPr>
+              <w:spacing w:before="60" w:after="60"/>
+            </w:pPr>
+            <w:r>
+              <w:rPr>
+                <w:sz w:val="17"/>
+              </w:rPr>
+              <w:t>AGENT DE SAISIE</w:t>
+            </w:r>
+          </w:p>
+        </w:tc>
+        <w:tc>
+          <w:tcPr>
+            <w:tcW w:type="dxa" w:w="1728"/>
+            <w:shd w:fill="F8FAFC"/>
+            <w:vAlign w:val="center"/>
+          </w:tcPr>
+          <w:p>
+            <w:pPr>
+              <w:spacing w:before="60" w:after="60"/>
+            </w:pPr>
+            <w:r>
+              <w:rPr>
+                <w:sz w:val="17"/>
+              </w:rPr>
+              <w:t>Aéroport Port-Bouët Fret</w:t>
             </w:r>
           </w:p>
         </w:tc>
         <w:tc>
           <w:tcPr>
             <w:tcW w:type="dxa" w:w="1296"/>
-            <w:shd w:fill="F7FAFC"/>
-            <w:tcMar>
-              <w:top w:w="100" w:type="dxa"/>
-              <w:bottom w:w="100" w:type="dxa"/>
-              <w:left w:w="100" w:type="dxa"/>
-              <w:right w:w="100" w:type="dxa"/>
-            </w:tcMar>
-            <w:tcBorders>
-              <w:top w:val="single" w:sz="4" w:space="0" w:color="E2E8F0"/>
-              <w:bottom w:val="single" w:sz="4" w:space="0" w:color="E2E8F0"/>
-              <w:left w:val="none"/>
-              <w:right w:val="none"/>
-            </w:tcBorders>
+            <w:shd w:fill="F8FAFC"/>
             <w:vAlign w:val="center"/>
           </w:tcPr>
           <w:p>
             <w:pPr>
+              <w:spacing w:before="60" w:after="60"/>
               <w:jc w:val="center"/>
             </w:pPr>
             <w:r>
               <w:rPr>
                 <w:b/>
-                <w:color w:val="C53030"/>
+                <w:color w:val="B91C1C"/>
                 <w:sz w:val="17"/>
               </w:rPr>
               <w:t>lbp2026</w:t>
-            </w:r>
-          </w:p>
-        </w:tc>
-        <w:tc>
-          <w:tcPr>
-            <w:tcW w:type="dxa" w:w="1584"/>
-            <w:shd w:fill="F7FAFC"/>
-            <w:tcMar>
-              <w:top w:w="100" w:type="dxa"/>
-              <w:bottom w:w="100" w:type="dxa"/>
-              <w:left w:w="100" w:type="dxa"/>
-              <w:right w:w="100" w:type="dxa"/>
-            </w:tcMar>
-            <w:tcBorders>
-              <w:top w:val="single" w:sz="4" w:space="0" w:color="E2E8F0"/>
-              <w:bottom w:val="single" w:sz="4" w:space="0" w:color="E2E8F0"/>
-              <w:left w:val="none"/>
-              <w:right w:val="none"/>
-            </w:tcBorders>
-            <w:vAlign w:val="center"/>
-          </w:tcPr>
-          <w:p>
-            <w:pPr>
-              <w:jc w:val="left"/>
-            </w:pPr>
-            <w:r>
-              <w:rPr>
-                <w:color w:val="2D3748"/>
-                <w:sz w:val="17"/>
-              </w:rPr>
-              <w:t>Aéroport Fret</w:t>
-            </w:r>
-          </w:p>
-        </w:tc>
-        <w:tc>
-          <w:tcPr>
-            <w:tcW w:type="dxa" w:w="1584"/>
-            <w:shd w:fill="F7FAFC"/>
-            <w:tcMar>
-              <w:top w:w="100" w:type="dxa"/>
-              <w:bottom w:w="100" w:type="dxa"/>
-              <w:left w:w="100" w:type="dxa"/>
-              <w:right w:w="100" w:type="dxa"/>
-            </w:tcMar>
-            <w:tcBorders>
-              <w:top w:val="single" w:sz="4" w:space="0" w:color="E2E8F0"/>
-              <w:bottom w:val="single" w:sz="4" w:space="0" w:color="E2E8F0"/>
-              <w:left w:val="none"/>
-              <w:right w:val="none"/>
-            </w:tcBorders>
-            <w:vAlign w:val="center"/>
-          </w:tcPr>
-          <w:p>
-            <w:pPr>
-              <w:jc w:val="left"/>
-            </w:pPr>
-            <w:r>
-              <w:rPr>
-                <w:color w:val="2D3748"/>
-                <w:sz w:val="17"/>
-              </w:rPr>
-              <w:t>Agent de Saisie</w:t>
             </w:r>
           </w:p>
         </w:tc>
@@ -2246,28 +1375,16 @@
           <w:tcPr>
             <w:tcW w:type="dxa" w:w="576"/>
             <w:shd w:fill="FFFFFF"/>
-            <w:tcMar>
-              <w:top w:w="100" w:type="dxa"/>
-              <w:bottom w:w="100" w:type="dxa"/>
-              <w:left w:w="100" w:type="dxa"/>
-              <w:right w:w="100" w:type="dxa"/>
-            </w:tcMar>
-            <w:tcBorders>
-              <w:top w:val="single" w:sz="4" w:space="0" w:color="E2E8F0"/>
-              <w:bottom w:val="single" w:sz="4" w:space="0" w:color="E2E8F0"/>
-              <w:left w:val="none"/>
-              <w:right w:val="none"/>
-            </w:tcBorders>
             <w:vAlign w:val="center"/>
           </w:tcPr>
           <w:p>
             <w:pPr>
+              <w:spacing w:before="60" w:after="60"/>
               <w:jc w:val="center"/>
             </w:pPr>
             <w:r>
               <w:rPr>
                 <w:b/>
-                <w:color w:val="718096"/>
                 <w:sz w:val="17"/>
               </w:rPr>
               <w:t>11</w:t>
@@ -2276,30 +1393,18 @@
         </w:tc>
         <w:tc>
           <w:tcPr>
-            <w:tcW w:type="dxa" w:w="2448"/>
+            <w:tcW w:type="dxa" w:w="2160"/>
             <w:shd w:fill="FFFFFF"/>
-            <w:tcMar>
-              <w:top w:w="100" w:type="dxa"/>
-              <w:bottom w:w="100" w:type="dxa"/>
-              <w:left w:w="100" w:type="dxa"/>
-              <w:right w:w="100" w:type="dxa"/>
-            </w:tcMar>
-            <w:tcBorders>
-              <w:top w:val="single" w:sz="4" w:space="0" w:color="E2E8F0"/>
-              <w:bottom w:val="single" w:sz="4" w:space="0" w:color="E2E8F0"/>
-              <w:left w:val="none"/>
-              <w:right w:val="none"/>
-            </w:tcBorders>
             <w:vAlign w:val="center"/>
           </w:tcPr>
           <w:p>
             <w:pPr>
-              <w:jc w:val="left"/>
+              <w:spacing w:before="60" w:after="60"/>
             </w:pPr>
             <w:r>
               <w:rPr>
                 <w:b/>
-                <w:color w:val="1A365D"/>
+                <w:color w:val="0F172A"/>
                 <w:sz w:val="17"/>
               </w:rPr>
               <w:t>ADEPO MARIE ESTHER</w:t>
@@ -2308,29 +1413,17 @@
         </w:tc>
         <w:tc>
           <w:tcPr>
-            <w:tcW w:type="dxa" w:w="2736"/>
+            <w:tcW w:type="dxa" w:w="2592"/>
             <w:shd w:fill="FFFFFF"/>
-            <w:tcMar>
-              <w:top w:w="100" w:type="dxa"/>
-              <w:bottom w:w="100" w:type="dxa"/>
-              <w:left w:w="100" w:type="dxa"/>
-              <w:right w:w="100" w:type="dxa"/>
-            </w:tcMar>
-            <w:tcBorders>
-              <w:top w:val="single" w:sz="4" w:space="0" w:color="E2E8F0"/>
-              <w:bottom w:val="single" w:sz="4" w:space="0" w:color="E2E8F0"/>
-              <w:left w:val="none"/>
-              <w:right w:val="none"/>
-            </w:tcBorders>
             <w:vAlign w:val="center"/>
           </w:tcPr>
           <w:p>
             <w:pPr>
-              <w:jc w:val="left"/>
+              <w:spacing w:before="60" w:after="60"/>
             </w:pPr>
             <w:r>
               <w:rPr>
-                <w:color w:val="2B6CB0"/>
+                <w:color w:val="0284C7"/>
                 <w:sz w:val="17"/>
               </w:rPr>
               <w:t>estelle.adepo@labelleporte.ci</w:t>
@@ -2339,95 +1432,58 @@
         </w:tc>
         <w:tc>
           <w:tcPr>
-            <w:tcW w:type="dxa" w:w="1296"/>
+            <w:tcW w:type="dxa" w:w="1872"/>
             <w:shd w:fill="FFFFFF"/>
-            <w:tcMar>
-              <w:top w:w="100" w:type="dxa"/>
-              <w:bottom w:w="100" w:type="dxa"/>
-              <w:left w:w="100" w:type="dxa"/>
-              <w:right w:w="100" w:type="dxa"/>
-            </w:tcMar>
-            <w:tcBorders>
-              <w:top w:val="single" w:sz="4" w:space="0" w:color="E2E8F0"/>
-              <w:bottom w:val="single" w:sz="4" w:space="0" w:color="E2E8F0"/>
-              <w:left w:val="none"/>
-              <w:right w:val="none"/>
-            </w:tcBorders>
             <w:vAlign w:val="center"/>
           </w:tcPr>
           <w:p>
             <w:pPr>
+              <w:spacing w:before="60" w:after="60"/>
+            </w:pPr>
+            <w:r>
+              <w:rPr>
+                <w:sz w:val="17"/>
+              </w:rPr>
+              <w:t>CHEF D'AGENCE</w:t>
+            </w:r>
+          </w:p>
+        </w:tc>
+        <w:tc>
+          <w:tcPr>
+            <w:tcW w:type="dxa" w:w="1728"/>
+            <w:shd w:fill="FFFFFF"/>
+            <w:vAlign w:val="center"/>
+          </w:tcPr>
+          <w:p>
+            <w:pPr>
+              <w:spacing w:before="60" w:after="60"/>
+            </w:pPr>
+            <w:r>
+              <w:rPr>
+                <w:sz w:val="17"/>
+              </w:rPr>
+              <w:t>Agence Sénégal (Dakar)</w:t>
+            </w:r>
+          </w:p>
+        </w:tc>
+        <w:tc>
+          <w:tcPr>
+            <w:tcW w:type="dxa" w:w="1296"/>
+            <w:shd w:fill="FFFFFF"/>
+            <w:vAlign w:val="center"/>
+          </w:tcPr>
+          <w:p>
+            <w:pPr>
+              <w:spacing w:before="60" w:after="60"/>
               <w:jc w:val="center"/>
             </w:pPr>
             <w:r>
               <w:rPr>
                 <w:b/>
-                <w:color w:val="C53030"/>
+                <w:color w:val="B91C1C"/>
                 <w:sz w:val="17"/>
               </w:rPr>
               <w:t>lbp2026</w:t>
-            </w:r>
-          </w:p>
-        </w:tc>
-        <w:tc>
-          <w:tcPr>
-            <w:tcW w:type="dxa" w:w="1584"/>
-            <w:shd w:fill="FFFFFF"/>
-            <w:tcMar>
-              <w:top w:w="100" w:type="dxa"/>
-              <w:bottom w:w="100" w:type="dxa"/>
-              <w:left w:w="100" w:type="dxa"/>
-              <w:right w:w="100" w:type="dxa"/>
-            </w:tcMar>
-            <w:tcBorders>
-              <w:top w:val="single" w:sz="4" w:space="0" w:color="E2E8F0"/>
-              <w:bottom w:val="single" w:sz="4" w:space="0" w:color="E2E8F0"/>
-              <w:left w:val="none"/>
-              <w:right w:val="none"/>
-            </w:tcBorders>
-            <w:vAlign w:val="center"/>
-          </w:tcPr>
-          <w:p>
-            <w:pPr>
-              <w:jc w:val="left"/>
-            </w:pPr>
-            <w:r>
-              <w:rPr>
-                <w:color w:val="2D3748"/>
-                <w:sz w:val="17"/>
-              </w:rPr>
-              <w:t>Agence Sénégal</w:t>
-            </w:r>
-          </w:p>
-        </w:tc>
-        <w:tc>
-          <w:tcPr>
-            <w:tcW w:type="dxa" w:w="1584"/>
-            <w:shd w:fill="FFFFFF"/>
-            <w:tcMar>
-              <w:top w:w="100" w:type="dxa"/>
-              <w:bottom w:w="100" w:type="dxa"/>
-              <w:left w:w="100" w:type="dxa"/>
-              <w:right w:w="100" w:type="dxa"/>
-            </w:tcMar>
-            <w:tcBorders>
-              <w:top w:val="single" w:sz="4" w:space="0" w:color="E2E8F0"/>
-              <w:bottom w:val="single" w:sz="4" w:space="0" w:color="E2E8F0"/>
-              <w:left w:val="none"/>
-              <w:right w:val="none"/>
-            </w:tcBorders>
-            <w:vAlign w:val="center"/>
-          </w:tcPr>
-          <w:p>
-            <w:pPr>
-              <w:jc w:val="left"/>
-            </w:pPr>
-            <w:r>
-              <w:rPr>
-                <w:color w:val="2D3748"/>
-                <w:sz w:val="17"/>
-              </w:rPr>
-              <w:t>Chef d'Agence</w:t>
             </w:r>
           </w:p>
         </w:tc>
@@ -2436,29 +1492,17 @@
         <w:tc>
           <w:tcPr>
             <w:tcW w:type="dxa" w:w="576"/>
-            <w:shd w:fill="F7FAFC"/>
-            <w:tcMar>
-              <w:top w:w="100" w:type="dxa"/>
-              <w:bottom w:w="100" w:type="dxa"/>
-              <w:left w:w="100" w:type="dxa"/>
-              <w:right w:w="100" w:type="dxa"/>
-            </w:tcMar>
-            <w:tcBorders>
-              <w:top w:val="single" w:sz="4" w:space="0" w:color="E2E8F0"/>
-              <w:bottom w:val="single" w:sz="4" w:space="0" w:color="E2E8F0"/>
-              <w:left w:val="none"/>
-              <w:right w:val="none"/>
-            </w:tcBorders>
+            <w:shd w:fill="F8FAFC"/>
             <w:vAlign w:val="center"/>
           </w:tcPr>
           <w:p>
             <w:pPr>
+              <w:spacing w:before="60" w:after="60"/>
               <w:jc w:val="center"/>
             </w:pPr>
             <w:r>
               <w:rPr>
                 <w:b/>
-                <w:color w:val="718096"/>
                 <w:sz w:val="17"/>
               </w:rPr>
               <w:t>12</w:t>
@@ -2467,30 +1511,18 @@
         </w:tc>
         <w:tc>
           <w:tcPr>
-            <w:tcW w:type="dxa" w:w="2448"/>
-            <w:shd w:fill="F7FAFC"/>
-            <w:tcMar>
-              <w:top w:w="100" w:type="dxa"/>
-              <w:bottom w:w="100" w:type="dxa"/>
-              <w:left w:w="100" w:type="dxa"/>
-              <w:right w:w="100" w:type="dxa"/>
-            </w:tcMar>
-            <w:tcBorders>
-              <w:top w:val="single" w:sz="4" w:space="0" w:color="E2E8F0"/>
-              <w:bottom w:val="single" w:sz="4" w:space="0" w:color="E2E8F0"/>
-              <w:left w:val="none"/>
-              <w:right w:val="none"/>
-            </w:tcBorders>
+            <w:tcW w:type="dxa" w:w="2160"/>
+            <w:shd w:fill="F8FAFC"/>
             <w:vAlign w:val="center"/>
           </w:tcPr>
           <w:p>
             <w:pPr>
-              <w:jc w:val="left"/>
+              <w:spacing w:before="60" w:after="60"/>
             </w:pPr>
             <w:r>
               <w:rPr>
                 <w:b/>
-                <w:color w:val="1A365D"/>
+                <w:color w:val="0F172A"/>
                 <w:sz w:val="17"/>
               </w:rPr>
               <w:t>DJAMBITCHE SARAH STEPHANIE</w:t>
@@ -2499,29 +1531,17 @@
         </w:tc>
         <w:tc>
           <w:tcPr>
-            <w:tcW w:type="dxa" w:w="2736"/>
-            <w:shd w:fill="F7FAFC"/>
-            <w:tcMar>
-              <w:top w:w="100" w:type="dxa"/>
-              <w:bottom w:w="100" w:type="dxa"/>
-              <w:left w:w="100" w:type="dxa"/>
-              <w:right w:w="100" w:type="dxa"/>
-            </w:tcMar>
-            <w:tcBorders>
-              <w:top w:val="single" w:sz="4" w:space="0" w:color="E2E8F0"/>
-              <w:bottom w:val="single" w:sz="4" w:space="0" w:color="E2E8F0"/>
-              <w:left w:val="none"/>
-              <w:right w:val="none"/>
-            </w:tcBorders>
+            <w:tcW w:type="dxa" w:w="2592"/>
+            <w:shd w:fill="F8FAFC"/>
             <w:vAlign w:val="center"/>
           </w:tcPr>
           <w:p>
             <w:pPr>
-              <w:jc w:val="left"/>
+              <w:spacing w:before="60" w:after="60"/>
             </w:pPr>
             <w:r>
               <w:rPr>
-                <w:color w:val="2B6CB0"/>
+                <w:color w:val="0284C7"/>
                 <w:sz w:val="17"/>
               </w:rPr>
               <w:t>sarah.djambitche@labelleporte.ci</w:t>
@@ -2530,61 +1550,34 @@
         </w:tc>
         <w:tc>
           <w:tcPr>
-            <w:tcW w:type="dxa" w:w="1296"/>
-            <w:shd w:fill="F7FAFC"/>
-            <w:tcMar>
-              <w:top w:w="100" w:type="dxa"/>
-              <w:bottom w:w="100" w:type="dxa"/>
-              <w:left w:w="100" w:type="dxa"/>
-              <w:right w:w="100" w:type="dxa"/>
-            </w:tcMar>
-            <w:tcBorders>
-              <w:top w:val="single" w:sz="4" w:space="0" w:color="E2E8F0"/>
-              <w:bottom w:val="single" w:sz="4" w:space="0" w:color="E2E8F0"/>
-              <w:left w:val="none"/>
-              <w:right w:val="none"/>
-            </w:tcBorders>
+            <w:tcW w:type="dxa" w:w="1872"/>
+            <w:shd w:fill="F8FAFC"/>
             <w:vAlign w:val="center"/>
           </w:tcPr>
           <w:p>
             <w:pPr>
-              <w:jc w:val="center"/>
+              <w:spacing w:before="60" w:after="60"/>
             </w:pPr>
             <w:r>
               <w:rPr>
-                <w:b/>
-                <w:color w:val="C53030"/>
                 <w:sz w:val="17"/>
               </w:rPr>
-              <w:t>lbp2026</w:t>
+              <w:t>AGENT DE SAISIE</w:t>
             </w:r>
           </w:p>
         </w:tc>
         <w:tc>
           <w:tcPr>
-            <w:tcW w:type="dxa" w:w="1584"/>
-            <w:shd w:fill="F7FAFC"/>
-            <w:tcMar>
-              <w:top w:w="100" w:type="dxa"/>
-              <w:bottom w:w="100" w:type="dxa"/>
-              <w:left w:w="100" w:type="dxa"/>
-              <w:right w:w="100" w:type="dxa"/>
-            </w:tcMar>
-            <w:tcBorders>
-              <w:top w:val="single" w:sz="4" w:space="0" w:color="E2E8F0"/>
-              <w:bottom w:val="single" w:sz="4" w:space="0" w:color="E2E8F0"/>
-              <w:left w:val="none"/>
-              <w:right w:val="none"/>
-            </w:tcBorders>
+            <w:tcW w:type="dxa" w:w="1728"/>
+            <w:shd w:fill="F8FAFC"/>
             <w:vAlign w:val="center"/>
           </w:tcPr>
           <w:p>
             <w:pPr>
-              <w:jc w:val="left"/>
+              <w:spacing w:before="60" w:after="60"/>
             </w:pPr>
             <w:r>
               <w:rPr>
-                <w:color w:val="2D3748"/>
                 <w:sz w:val="17"/>
               </w:rPr>
               <w:t>Agence Adjamé</w:t>
@@ -2593,32 +1586,22 @@
         </w:tc>
         <w:tc>
           <w:tcPr>
-            <w:tcW w:type="dxa" w:w="1584"/>
-            <w:shd w:fill="F7FAFC"/>
-            <w:tcMar>
-              <w:top w:w="100" w:type="dxa"/>
-              <w:bottom w:w="100" w:type="dxa"/>
-              <w:left w:w="100" w:type="dxa"/>
-              <w:right w:w="100" w:type="dxa"/>
-            </w:tcMar>
-            <w:tcBorders>
-              <w:top w:val="single" w:sz="4" w:space="0" w:color="E2E8F0"/>
-              <w:bottom w:val="single" w:sz="4" w:space="0" w:color="E2E8F0"/>
-              <w:left w:val="none"/>
-              <w:right w:val="none"/>
-            </w:tcBorders>
+            <w:tcW w:type="dxa" w:w="1296"/>
+            <w:shd w:fill="F8FAFC"/>
             <w:vAlign w:val="center"/>
           </w:tcPr>
           <w:p>
             <w:pPr>
-              <w:jc w:val="left"/>
+              <w:spacing w:before="60" w:after="60"/>
+              <w:jc w:val="center"/>
             </w:pPr>
             <w:r>
               <w:rPr>
-                <w:color w:val="2D3748"/>
+                <w:b/>
+                <w:color w:val="B91C1C"/>
                 <w:sz w:val="17"/>
               </w:rPr>
-              <w:t>Agent de Saisie</w:t>
+              <w:t>lbp2026</w:t>
             </w:r>
           </w:p>
         </w:tc>
@@ -2628,28 +1611,16 @@
           <w:tcPr>
             <w:tcW w:type="dxa" w:w="576"/>
             <w:shd w:fill="FFFFFF"/>
-            <w:tcMar>
-              <w:top w:w="100" w:type="dxa"/>
-              <w:bottom w:w="100" w:type="dxa"/>
-              <w:left w:w="100" w:type="dxa"/>
-              <w:right w:w="100" w:type="dxa"/>
-            </w:tcMar>
-            <w:tcBorders>
-              <w:top w:val="single" w:sz="4" w:space="0" w:color="E2E8F0"/>
-              <w:bottom w:val="single" w:sz="4" w:space="0" w:color="E2E8F0"/>
-              <w:left w:val="none"/>
-              <w:right w:val="none"/>
-            </w:tcBorders>
             <w:vAlign w:val="center"/>
           </w:tcPr>
           <w:p>
             <w:pPr>
+              <w:spacing w:before="60" w:after="60"/>
               <w:jc w:val="center"/>
             </w:pPr>
             <w:r>
               <w:rPr>
                 <w:b/>
-                <w:color w:val="718096"/>
                 <w:sz w:val="17"/>
               </w:rPr>
               <w:t>13</w:t>
@@ -2658,30 +1629,18 @@
         </w:tc>
         <w:tc>
           <w:tcPr>
-            <w:tcW w:type="dxa" w:w="2448"/>
+            <w:tcW w:type="dxa" w:w="2160"/>
             <w:shd w:fill="FFFFFF"/>
-            <w:tcMar>
-              <w:top w:w="100" w:type="dxa"/>
-              <w:bottom w:w="100" w:type="dxa"/>
-              <w:left w:w="100" w:type="dxa"/>
-              <w:right w:w="100" w:type="dxa"/>
-            </w:tcMar>
-            <w:tcBorders>
-              <w:top w:val="single" w:sz="4" w:space="0" w:color="E2E8F0"/>
-              <w:bottom w:val="single" w:sz="4" w:space="0" w:color="E2E8F0"/>
-              <w:left w:val="none"/>
-              <w:right w:val="none"/>
-            </w:tcBorders>
             <w:vAlign w:val="center"/>
           </w:tcPr>
           <w:p>
             <w:pPr>
-              <w:jc w:val="left"/>
+              <w:spacing w:before="60" w:after="60"/>
             </w:pPr>
             <w:r>
               <w:rPr>
                 <w:b/>
-                <w:color w:val="1A365D"/>
+                <w:color w:val="0F172A"/>
                 <w:sz w:val="17"/>
               </w:rPr>
               <w:t>KARABBOUE AMY</w:t>
@@ -2690,92 +1649,53 @@
         </w:tc>
         <w:tc>
           <w:tcPr>
-            <w:tcW w:type="dxa" w:w="2736"/>
+            <w:tcW w:type="dxa" w:w="2592"/>
             <w:shd w:fill="FFFFFF"/>
-            <w:tcMar>
-              <w:top w:w="100" w:type="dxa"/>
-              <w:bottom w:w="100" w:type="dxa"/>
-              <w:left w:w="100" w:type="dxa"/>
-              <w:right w:w="100" w:type="dxa"/>
-            </w:tcMar>
-            <w:tcBorders>
-              <w:top w:val="single" w:sz="4" w:space="0" w:color="E2E8F0"/>
-              <w:bottom w:val="single" w:sz="4" w:space="0" w:color="E2E8F0"/>
-              <w:left w:val="none"/>
-              <w:right w:val="none"/>
-            </w:tcBorders>
             <w:vAlign w:val="center"/>
           </w:tcPr>
           <w:p>
             <w:pPr>
-              <w:jc w:val="left"/>
+              <w:spacing w:before="60" w:after="60"/>
             </w:pPr>
             <w:r>
               <w:rPr>
-                <w:color w:val="2B6CB0"/>
+                <w:color w:val="0284C7"/>
                 <w:sz w:val="17"/>
               </w:rPr>
-              <w:t>amy.dieng@labelleporte.ci</w:t>
+              <w:t>karabboue.amy@labelleporte.ci</w:t>
             </w:r>
           </w:p>
         </w:tc>
         <w:tc>
           <w:tcPr>
-            <w:tcW w:type="dxa" w:w="1296"/>
+            <w:tcW w:type="dxa" w:w="1872"/>
             <w:shd w:fill="FFFFFF"/>
-            <w:tcMar>
-              <w:top w:w="100" w:type="dxa"/>
-              <w:bottom w:w="100" w:type="dxa"/>
-              <w:left w:w="100" w:type="dxa"/>
-              <w:right w:w="100" w:type="dxa"/>
-            </w:tcMar>
-            <w:tcBorders>
-              <w:top w:val="single" w:sz="4" w:space="0" w:color="E2E8F0"/>
-              <w:bottom w:val="single" w:sz="4" w:space="0" w:color="E2E8F0"/>
-              <w:left w:val="none"/>
-              <w:right w:val="none"/>
-            </w:tcBorders>
             <w:vAlign w:val="center"/>
           </w:tcPr>
           <w:p>
             <w:pPr>
-              <w:jc w:val="center"/>
+              <w:spacing w:before="60" w:after="60"/>
             </w:pPr>
             <w:r>
               <w:rPr>
-                <w:b/>
-                <w:color w:val="C53030"/>
                 <w:sz w:val="17"/>
               </w:rPr>
-              <w:t>lbp2026</w:t>
+              <w:t>AGENT DE SAISIE</w:t>
             </w:r>
           </w:p>
         </w:tc>
         <w:tc>
           <w:tcPr>
-            <w:tcW w:type="dxa" w:w="1584"/>
+            <w:tcW w:type="dxa" w:w="1728"/>
             <w:shd w:fill="FFFFFF"/>
-            <w:tcMar>
-              <w:top w:w="100" w:type="dxa"/>
-              <w:bottom w:w="100" w:type="dxa"/>
-              <w:left w:w="100" w:type="dxa"/>
-              <w:right w:w="100" w:type="dxa"/>
-            </w:tcMar>
-            <w:tcBorders>
-              <w:top w:val="single" w:sz="4" w:space="0" w:color="E2E8F0"/>
-              <w:bottom w:val="single" w:sz="4" w:space="0" w:color="E2E8F0"/>
-              <w:left w:val="none"/>
-              <w:right w:val="none"/>
-            </w:tcBorders>
             <w:vAlign w:val="center"/>
           </w:tcPr>
           <w:p>
             <w:pPr>
-              <w:jc w:val="left"/>
+              <w:spacing w:before="60" w:after="60"/>
             </w:pPr>
             <w:r>
               <w:rPr>
-                <w:color w:val="2D3748"/>
                 <w:sz w:val="17"/>
               </w:rPr>
               <w:t>Agence Adjamé</w:t>
@@ -2784,32 +1704,22 @@
         </w:tc>
         <w:tc>
           <w:tcPr>
-            <w:tcW w:type="dxa" w:w="1584"/>
+            <w:tcW w:type="dxa" w:w="1296"/>
             <w:shd w:fill="FFFFFF"/>
-            <w:tcMar>
-              <w:top w:w="100" w:type="dxa"/>
-              <w:bottom w:w="100" w:type="dxa"/>
-              <w:left w:w="100" w:type="dxa"/>
-              <w:right w:w="100" w:type="dxa"/>
-            </w:tcMar>
-            <w:tcBorders>
-              <w:top w:val="single" w:sz="4" w:space="0" w:color="E2E8F0"/>
-              <w:bottom w:val="single" w:sz="4" w:space="0" w:color="E2E8F0"/>
-              <w:left w:val="none"/>
-              <w:right w:val="none"/>
-            </w:tcBorders>
             <w:vAlign w:val="center"/>
           </w:tcPr>
           <w:p>
             <w:pPr>
-              <w:jc w:val="left"/>
+              <w:spacing w:before="60" w:after="60"/>
+              <w:jc w:val="center"/>
             </w:pPr>
             <w:r>
               <w:rPr>
-                <w:color w:val="2D3748"/>
+                <w:b/>
+                <w:color w:val="B91C1C"/>
                 <w:sz w:val="17"/>
               </w:rPr>
-              <w:t>Agent de Saisie</w:t>
+              <w:t>lbp2026</w:t>
             </w:r>
           </w:p>
         </w:tc>
@@ -2818,29 +1728,17 @@
         <w:tc>
           <w:tcPr>
             <w:tcW w:type="dxa" w:w="576"/>
-            <w:shd w:fill="F7FAFC"/>
-            <w:tcMar>
-              <w:top w:w="100" w:type="dxa"/>
-              <w:bottom w:w="100" w:type="dxa"/>
-              <w:left w:w="100" w:type="dxa"/>
-              <w:right w:w="100" w:type="dxa"/>
-            </w:tcMar>
-            <w:tcBorders>
-              <w:top w:val="single" w:sz="4" w:space="0" w:color="E2E8F0"/>
-              <w:bottom w:val="single" w:sz="4" w:space="0" w:color="E2E8F0"/>
-              <w:left w:val="none"/>
-              <w:right w:val="none"/>
-            </w:tcBorders>
+            <w:shd w:fill="F8FAFC"/>
             <w:vAlign w:val="center"/>
           </w:tcPr>
           <w:p>
             <w:pPr>
+              <w:spacing w:before="60" w:after="60"/>
               <w:jc w:val="center"/>
             </w:pPr>
             <w:r>
               <w:rPr>
                 <w:b/>
-                <w:color w:val="718096"/>
                 <w:sz w:val="17"/>
               </w:rPr>
               <w:t>14</w:t>
@@ -2849,30 +1747,18 @@
         </w:tc>
         <w:tc>
           <w:tcPr>
-            <w:tcW w:type="dxa" w:w="2448"/>
-            <w:shd w:fill="F7FAFC"/>
-            <w:tcMar>
-              <w:top w:w="100" w:type="dxa"/>
-              <w:bottom w:w="100" w:type="dxa"/>
-              <w:left w:w="100" w:type="dxa"/>
-              <w:right w:w="100" w:type="dxa"/>
-            </w:tcMar>
-            <w:tcBorders>
-              <w:top w:val="single" w:sz="4" w:space="0" w:color="E2E8F0"/>
-              <w:bottom w:val="single" w:sz="4" w:space="0" w:color="E2E8F0"/>
-              <w:left w:val="none"/>
-              <w:right w:val="none"/>
-            </w:tcBorders>
+            <w:tcW w:type="dxa" w:w="2160"/>
+            <w:shd w:fill="F8FAFC"/>
             <w:vAlign w:val="center"/>
           </w:tcPr>
           <w:p>
             <w:pPr>
-              <w:jc w:val="left"/>
+              <w:spacing w:before="60" w:after="60"/>
             </w:pPr>
             <w:r>
               <w:rPr>
                 <w:b/>
-                <w:color w:val="1A365D"/>
+                <w:color w:val="0F172A"/>
                 <w:sz w:val="17"/>
               </w:rPr>
               <w:t>SERY GRACE</w:t>
@@ -2881,92 +1767,53 @@
         </w:tc>
         <w:tc>
           <w:tcPr>
-            <w:tcW w:type="dxa" w:w="2736"/>
-            <w:shd w:fill="F7FAFC"/>
-            <w:tcMar>
-              <w:top w:w="100" w:type="dxa"/>
-              <w:bottom w:w="100" w:type="dxa"/>
-              <w:left w:w="100" w:type="dxa"/>
-              <w:right w:w="100" w:type="dxa"/>
-            </w:tcMar>
-            <w:tcBorders>
-              <w:top w:val="single" w:sz="4" w:space="0" w:color="E2E8F0"/>
-              <w:bottom w:val="single" w:sz="4" w:space="0" w:color="E2E8F0"/>
-              <w:left w:val="none"/>
-              <w:right w:val="none"/>
-            </w:tcBorders>
+            <w:tcW w:type="dxa" w:w="2592"/>
+            <w:shd w:fill="F8FAFC"/>
             <w:vAlign w:val="center"/>
           </w:tcPr>
           <w:p>
             <w:pPr>
-              <w:jc w:val="left"/>
+              <w:spacing w:before="60" w:after="60"/>
             </w:pPr>
             <w:r>
               <w:rPr>
-                <w:color w:val="2B6CB0"/>
+                <w:color w:val="0284C7"/>
                 <w:sz w:val="17"/>
               </w:rPr>
-              <w:t>grace.sery@labelleporte.ci</w:t>
+              <w:t>sery.grace@labelleporte.ci</w:t>
             </w:r>
           </w:p>
         </w:tc>
         <w:tc>
           <w:tcPr>
-            <w:tcW w:type="dxa" w:w="1296"/>
-            <w:shd w:fill="F7FAFC"/>
-            <w:tcMar>
-              <w:top w:w="100" w:type="dxa"/>
-              <w:bottom w:w="100" w:type="dxa"/>
-              <w:left w:w="100" w:type="dxa"/>
-              <w:right w:w="100" w:type="dxa"/>
-            </w:tcMar>
-            <w:tcBorders>
-              <w:top w:val="single" w:sz="4" w:space="0" w:color="E2E8F0"/>
-              <w:bottom w:val="single" w:sz="4" w:space="0" w:color="E2E8F0"/>
-              <w:left w:val="none"/>
-              <w:right w:val="none"/>
-            </w:tcBorders>
+            <w:tcW w:type="dxa" w:w="1872"/>
+            <w:shd w:fill="F8FAFC"/>
             <w:vAlign w:val="center"/>
           </w:tcPr>
           <w:p>
             <w:pPr>
-              <w:jc w:val="center"/>
+              <w:spacing w:before="60" w:after="60"/>
             </w:pPr>
             <w:r>
               <w:rPr>
-                <w:b/>
-                <w:color w:val="C53030"/>
                 <w:sz w:val="17"/>
               </w:rPr>
-              <w:t>lbp2026</w:t>
+              <w:t>AGENT DE SAISIE</w:t>
             </w:r>
           </w:p>
         </w:tc>
         <w:tc>
           <w:tcPr>
-            <w:tcW w:type="dxa" w:w="1584"/>
-            <w:shd w:fill="F7FAFC"/>
-            <w:tcMar>
-              <w:top w:w="100" w:type="dxa"/>
-              <w:bottom w:w="100" w:type="dxa"/>
-              <w:left w:w="100" w:type="dxa"/>
-              <w:right w:w="100" w:type="dxa"/>
-            </w:tcMar>
-            <w:tcBorders>
-              <w:top w:val="single" w:sz="4" w:space="0" w:color="E2E8F0"/>
-              <w:bottom w:val="single" w:sz="4" w:space="0" w:color="E2E8F0"/>
-              <w:left w:val="none"/>
-              <w:right w:val="none"/>
-            </w:tcBorders>
+            <w:tcW w:type="dxa" w:w="1728"/>
+            <w:shd w:fill="F8FAFC"/>
             <w:vAlign w:val="center"/>
           </w:tcPr>
           <w:p>
             <w:pPr>
-              <w:jc w:val="left"/>
+              <w:spacing w:before="60" w:after="60"/>
             </w:pPr>
             <w:r>
               <w:rPr>
-                <w:color w:val="2D3748"/>
                 <w:sz w:val="17"/>
               </w:rPr>
               <w:t>Agence Adjamé</w:t>
@@ -2975,32 +1822,22 @@
         </w:tc>
         <w:tc>
           <w:tcPr>
-            <w:tcW w:type="dxa" w:w="1584"/>
-            <w:shd w:fill="F7FAFC"/>
-            <w:tcMar>
-              <w:top w:w="100" w:type="dxa"/>
-              <w:bottom w:w="100" w:type="dxa"/>
-              <w:left w:w="100" w:type="dxa"/>
-              <w:right w:w="100" w:type="dxa"/>
-            </w:tcMar>
-            <w:tcBorders>
-              <w:top w:val="single" w:sz="4" w:space="0" w:color="E2E8F0"/>
-              <w:bottom w:val="single" w:sz="4" w:space="0" w:color="E2E8F0"/>
-              <w:left w:val="none"/>
-              <w:right w:val="none"/>
-            </w:tcBorders>
+            <w:tcW w:type="dxa" w:w="1296"/>
+            <w:shd w:fill="F8FAFC"/>
             <w:vAlign w:val="center"/>
           </w:tcPr>
           <w:p>
             <w:pPr>
-              <w:jc w:val="left"/>
+              <w:spacing w:before="60" w:after="60"/>
+              <w:jc w:val="center"/>
             </w:pPr>
             <w:r>
               <w:rPr>
-                <w:color w:val="2D3748"/>
+                <w:b/>
+                <w:color w:val="B91C1C"/>
                 <w:sz w:val="17"/>
               </w:rPr>
-              <w:t>Agent de Saisie</w:t>
+              <w:t>lbp2026</w:t>
             </w:r>
           </w:p>
         </w:tc>
@@ -3010,28 +1847,16 @@
           <w:tcPr>
             <w:tcW w:type="dxa" w:w="576"/>
             <w:shd w:fill="FFFFFF"/>
-            <w:tcMar>
-              <w:top w:w="100" w:type="dxa"/>
-              <w:bottom w:w="100" w:type="dxa"/>
-              <w:left w:w="100" w:type="dxa"/>
-              <w:right w:w="100" w:type="dxa"/>
-            </w:tcMar>
-            <w:tcBorders>
-              <w:top w:val="single" w:sz="4" w:space="0" w:color="E2E8F0"/>
-              <w:bottom w:val="single" w:sz="4" w:space="0" w:color="E2E8F0"/>
-              <w:left w:val="none"/>
-              <w:right w:val="none"/>
-            </w:tcBorders>
             <w:vAlign w:val="center"/>
           </w:tcPr>
           <w:p>
             <w:pPr>
+              <w:spacing w:before="60" w:after="60"/>
               <w:jc w:val="center"/>
             </w:pPr>
             <w:r>
               <w:rPr>
                 <w:b/>
-                <w:color w:val="718096"/>
                 <w:sz w:val="17"/>
               </w:rPr>
               <w:t>15</w:t>
@@ -3040,30 +1865,18 @@
         </w:tc>
         <w:tc>
           <w:tcPr>
-            <w:tcW w:type="dxa" w:w="2448"/>
+            <w:tcW w:type="dxa" w:w="2160"/>
             <w:shd w:fill="FFFFFF"/>
-            <w:tcMar>
-              <w:top w:w="100" w:type="dxa"/>
-              <w:bottom w:w="100" w:type="dxa"/>
-              <w:left w:w="100" w:type="dxa"/>
-              <w:right w:w="100" w:type="dxa"/>
-            </w:tcMar>
-            <w:tcBorders>
-              <w:top w:val="single" w:sz="4" w:space="0" w:color="E2E8F0"/>
-              <w:bottom w:val="single" w:sz="4" w:space="0" w:color="E2E8F0"/>
-              <w:left w:val="none"/>
-              <w:right w:val="none"/>
-            </w:tcBorders>
             <w:vAlign w:val="center"/>
           </w:tcPr>
           <w:p>
             <w:pPr>
-              <w:jc w:val="left"/>
+              <w:spacing w:before="60" w:after="60"/>
             </w:pPr>
             <w:r>
               <w:rPr>
                 <w:b/>
-                <w:color w:val="1A365D"/>
+                <w:color w:val="0F172A"/>
                 <w:sz w:val="17"/>
               </w:rPr>
               <w:t>KADJO PRINCE</w:t>
@@ -3072,29 +1885,17 @@
         </w:tc>
         <w:tc>
           <w:tcPr>
-            <w:tcW w:type="dxa" w:w="2736"/>
+            <w:tcW w:type="dxa" w:w="2592"/>
             <w:shd w:fill="FFFFFF"/>
-            <w:tcMar>
-              <w:top w:w="100" w:type="dxa"/>
-              <w:bottom w:w="100" w:type="dxa"/>
-              <w:left w:w="100" w:type="dxa"/>
-              <w:right w:w="100" w:type="dxa"/>
-            </w:tcMar>
-            <w:tcBorders>
-              <w:top w:val="single" w:sz="4" w:space="0" w:color="E2E8F0"/>
-              <w:bottom w:val="single" w:sz="4" w:space="0" w:color="E2E8F0"/>
-              <w:left w:val="none"/>
-              <w:right w:val="none"/>
-            </w:tcBorders>
             <w:vAlign w:val="center"/>
           </w:tcPr>
           <w:p>
             <w:pPr>
-              <w:jc w:val="left"/>
+              <w:spacing w:before="60" w:after="60"/>
             </w:pPr>
             <w:r>
               <w:rPr>
-                <w:color w:val="2B6CB0"/>
+                <w:color w:val="0284C7"/>
                 <w:sz w:val="17"/>
               </w:rPr>
               <w:t>prince.kadjo@labelleporte.ci</w:t>
@@ -3103,61 +1904,34 @@
         </w:tc>
         <w:tc>
           <w:tcPr>
-            <w:tcW w:type="dxa" w:w="1296"/>
+            <w:tcW w:type="dxa" w:w="1872"/>
             <w:shd w:fill="FFFFFF"/>
-            <w:tcMar>
-              <w:top w:w="100" w:type="dxa"/>
-              <w:bottom w:w="100" w:type="dxa"/>
-              <w:left w:w="100" w:type="dxa"/>
-              <w:right w:w="100" w:type="dxa"/>
-            </w:tcMar>
-            <w:tcBorders>
-              <w:top w:val="single" w:sz="4" w:space="0" w:color="E2E8F0"/>
-              <w:bottom w:val="single" w:sz="4" w:space="0" w:color="E2E8F0"/>
-              <w:left w:val="none"/>
-              <w:right w:val="none"/>
-            </w:tcBorders>
             <w:vAlign w:val="center"/>
           </w:tcPr>
           <w:p>
             <w:pPr>
-              <w:jc w:val="center"/>
+              <w:spacing w:before="60" w:after="60"/>
             </w:pPr>
             <w:r>
               <w:rPr>
-                <w:b/>
-                <w:color w:val="C53030"/>
                 <w:sz w:val="17"/>
               </w:rPr>
-              <w:t>lbp2026</w:t>
+              <w:t>CHEF D'AGENCE</w:t>
             </w:r>
           </w:p>
         </w:tc>
         <w:tc>
           <w:tcPr>
-            <w:tcW w:type="dxa" w:w="1584"/>
+            <w:tcW w:type="dxa" w:w="1728"/>
             <w:shd w:fill="FFFFFF"/>
-            <w:tcMar>
-              <w:top w:w="100" w:type="dxa"/>
-              <w:bottom w:w="100" w:type="dxa"/>
-              <w:left w:w="100" w:type="dxa"/>
-              <w:right w:w="100" w:type="dxa"/>
-            </w:tcMar>
-            <w:tcBorders>
-              <w:top w:val="single" w:sz="4" w:space="0" w:color="E2E8F0"/>
-              <w:bottom w:val="single" w:sz="4" w:space="0" w:color="E2E8F0"/>
-              <w:left w:val="none"/>
-              <w:right w:val="none"/>
-            </w:tcBorders>
             <w:vAlign w:val="center"/>
           </w:tcPr>
           <w:p>
             <w:pPr>
-              <w:jc w:val="left"/>
+              <w:spacing w:before="60" w:after="60"/>
             </w:pPr>
             <w:r>
               <w:rPr>
-                <w:color w:val="2D3748"/>
                 <w:sz w:val="17"/>
               </w:rPr>
               <w:t>Agence France (Paris)</w:t>
@@ -3166,32 +1940,848 @@
         </w:tc>
         <w:tc>
           <w:tcPr>
-            <w:tcW w:type="dxa" w:w="1584"/>
+            <w:tcW w:type="dxa" w:w="1296"/>
             <w:shd w:fill="FFFFFF"/>
-            <w:tcMar>
-              <w:top w:w="100" w:type="dxa"/>
-              <w:bottom w:w="100" w:type="dxa"/>
-              <w:left w:w="100" w:type="dxa"/>
-              <w:right w:w="100" w:type="dxa"/>
-            </w:tcMar>
-            <w:tcBorders>
-              <w:top w:val="single" w:sz="4" w:space="0" w:color="E2E8F0"/>
-              <w:bottom w:val="single" w:sz="4" w:space="0" w:color="E2E8F0"/>
-              <w:left w:val="none"/>
-              <w:right w:val="none"/>
-            </w:tcBorders>
             <w:vAlign w:val="center"/>
           </w:tcPr>
           <w:p>
             <w:pPr>
-              <w:jc w:val="left"/>
+              <w:spacing w:before="60" w:after="60"/>
+              <w:jc w:val="center"/>
             </w:pPr>
             <w:r>
               <w:rPr>
-                <w:color w:val="2D3748"/>
+                <w:b/>
+                <w:color w:val="B91C1C"/>
                 <w:sz w:val="17"/>
               </w:rPr>
-              <w:t>Chef d'Agence / Resp. Paris</w:t>
+              <w:t>lbp2026</w:t>
+            </w:r>
+          </w:p>
+        </w:tc>
+      </w:tr>
+      <w:tr>
+        <w:tc>
+          <w:tcPr>
+            <w:tcW w:type="dxa" w:w="576"/>
+            <w:shd w:fill="F8FAFC"/>
+            <w:vAlign w:val="center"/>
+          </w:tcPr>
+          <w:p>
+            <w:pPr>
+              <w:spacing w:before="60" w:after="60"/>
+              <w:jc w:val="center"/>
+            </w:pPr>
+            <w:r>
+              <w:rPr>
+                <w:b/>
+                <w:sz w:val="17"/>
+              </w:rPr>
+              <w:t>16</w:t>
+            </w:r>
+          </w:p>
+        </w:tc>
+        <w:tc>
+          <w:tcPr>
+            <w:tcW w:type="dxa" w:w="2160"/>
+            <w:shd w:fill="F8FAFC"/>
+            <w:vAlign w:val="center"/>
+          </w:tcPr>
+          <w:p>
+            <w:pPr>
+              <w:spacing w:before="60" w:after="60"/>
+            </w:pPr>
+            <w:r>
+              <w:rPr>
+                <w:b/>
+                <w:color w:val="0F172A"/>
+                <w:sz w:val="17"/>
+              </w:rPr>
+              <w:t>Claude Yedess</w:t>
+            </w:r>
+          </w:p>
+        </w:tc>
+        <w:tc>
+          <w:tcPr>
+            <w:tcW w:type="dxa" w:w="2592"/>
+            <w:shd w:fill="F8FAFC"/>
+            <w:vAlign w:val="center"/>
+          </w:tcPr>
+          <w:p>
+            <w:pPr>
+              <w:spacing w:before="60" w:after="60"/>
+            </w:pPr>
+            <w:r>
+              <w:rPr>
+                <w:color w:val="0284C7"/>
+                <w:sz w:val="17"/>
+              </w:rPr>
+              <w:t>claude.yedess@labelleporte.ci</w:t>
+            </w:r>
+          </w:p>
+        </w:tc>
+        <w:tc>
+          <w:tcPr>
+            <w:tcW w:type="dxa" w:w="1872"/>
+            <w:shd w:fill="F8FAFC"/>
+            <w:vAlign w:val="center"/>
+          </w:tcPr>
+          <w:p>
+            <w:pPr>
+              <w:spacing w:before="60" w:after="60"/>
+            </w:pPr>
+            <w:r>
+              <w:rPr>
+                <w:sz w:val="17"/>
+              </w:rPr>
+              <w:t>ASSISTANTE DIRECTION GENERALE</w:t>
+            </w:r>
+          </w:p>
+        </w:tc>
+        <w:tc>
+          <w:tcPr>
+            <w:tcW w:type="dxa" w:w="1728"/>
+            <w:shd w:fill="F8FAFC"/>
+            <w:vAlign w:val="center"/>
+          </w:tcPr>
+          <w:p>
+            <w:pPr>
+              <w:spacing w:before="60" w:after="60"/>
+            </w:pPr>
+            <w:r>
+              <w:rPr>
+                <w:sz w:val="17"/>
+              </w:rPr>
+              <w:t>Toutes les agences</w:t>
+            </w:r>
+          </w:p>
+        </w:tc>
+        <w:tc>
+          <w:tcPr>
+            <w:tcW w:type="dxa" w:w="1296"/>
+            <w:shd w:fill="F8FAFC"/>
+            <w:vAlign w:val="center"/>
+          </w:tcPr>
+          <w:p>
+            <w:pPr>
+              <w:spacing w:before="60" w:after="60"/>
+              <w:jc w:val="center"/>
+            </w:pPr>
+            <w:r>
+              <w:rPr>
+                <w:b/>
+                <w:color w:val="B91C1C"/>
+                <w:sz w:val="17"/>
+              </w:rPr>
+              <w:t>lbp2026</w:t>
+            </w:r>
+          </w:p>
+        </w:tc>
+      </w:tr>
+      <w:tr>
+        <w:tc>
+          <w:tcPr>
+            <w:tcW w:type="dxa" w:w="576"/>
+            <w:shd w:fill="FFFFFF"/>
+            <w:vAlign w:val="center"/>
+          </w:tcPr>
+          <w:p>
+            <w:pPr>
+              <w:spacing w:before="60" w:after="60"/>
+              <w:jc w:val="center"/>
+            </w:pPr>
+            <w:r>
+              <w:rPr>
+                <w:b/>
+                <w:sz w:val="17"/>
+              </w:rPr>
+              <w:t>17</w:t>
+            </w:r>
+          </w:p>
+        </w:tc>
+        <w:tc>
+          <w:tcPr>
+            <w:tcW w:type="dxa" w:w="2160"/>
+            <w:shd w:fill="FFFFFF"/>
+            <w:vAlign w:val="center"/>
+          </w:tcPr>
+          <w:p>
+            <w:pPr>
+              <w:spacing w:before="60" w:after="60"/>
+            </w:pPr>
+            <w:r>
+              <w:rPr>
+                <w:b/>
+                <w:color w:val="0F172A"/>
+                <w:sz w:val="17"/>
+              </w:rPr>
+              <w:t>Dieng Amy</w:t>
+            </w:r>
+          </w:p>
+        </w:tc>
+        <w:tc>
+          <w:tcPr>
+            <w:tcW w:type="dxa" w:w="2592"/>
+            <w:shd w:fill="FFFFFF"/>
+            <w:vAlign w:val="center"/>
+          </w:tcPr>
+          <w:p>
+            <w:pPr>
+              <w:spacing w:before="60" w:after="60"/>
+            </w:pPr>
+            <w:r>
+              <w:rPr>
+                <w:color w:val="0284C7"/>
+                <w:sz w:val="17"/>
+              </w:rPr>
+              <w:t>amy.dieng@labelleporte.ci</w:t>
+            </w:r>
+          </w:p>
+        </w:tc>
+        <w:tc>
+          <w:tcPr>
+            <w:tcW w:type="dxa" w:w="1872"/>
+            <w:shd w:fill="FFFFFF"/>
+            <w:vAlign w:val="center"/>
+          </w:tcPr>
+          <w:p>
+            <w:pPr>
+              <w:spacing w:before="60" w:after="60"/>
+            </w:pPr>
+            <w:r>
+              <w:rPr>
+                <w:sz w:val="17"/>
+              </w:rPr>
+              <w:t>AGENT DE SAISIE</w:t>
+            </w:r>
+          </w:p>
+        </w:tc>
+        <w:tc>
+          <w:tcPr>
+            <w:tcW w:type="dxa" w:w="1728"/>
+            <w:shd w:fill="FFFFFF"/>
+            <w:vAlign w:val="center"/>
+          </w:tcPr>
+          <w:p>
+            <w:pPr>
+              <w:spacing w:before="60" w:after="60"/>
+            </w:pPr>
+            <w:r>
+              <w:rPr>
+                <w:sz w:val="17"/>
+              </w:rPr>
+              <w:t>Agence Sénégal (Dakar)</w:t>
+            </w:r>
+          </w:p>
+        </w:tc>
+        <w:tc>
+          <w:tcPr>
+            <w:tcW w:type="dxa" w:w="1296"/>
+            <w:shd w:fill="FFFFFF"/>
+            <w:vAlign w:val="center"/>
+          </w:tcPr>
+          <w:p>
+            <w:pPr>
+              <w:spacing w:before="60" w:after="60"/>
+              <w:jc w:val="center"/>
+            </w:pPr>
+            <w:r>
+              <w:rPr>
+                <w:b/>
+                <w:color w:val="B91C1C"/>
+                <w:sz w:val="17"/>
+              </w:rPr>
+              <w:t>lbp2026</w:t>
+            </w:r>
+          </w:p>
+        </w:tc>
+      </w:tr>
+      <w:tr>
+        <w:tc>
+          <w:tcPr>
+            <w:tcW w:type="dxa" w:w="576"/>
+            <w:shd w:fill="F8FAFC"/>
+            <w:vAlign w:val="center"/>
+          </w:tcPr>
+          <w:p>
+            <w:pPr>
+              <w:spacing w:before="60" w:after="60"/>
+              <w:jc w:val="center"/>
+            </w:pPr>
+            <w:r>
+              <w:rPr>
+                <w:b/>
+                <w:sz w:val="17"/>
+              </w:rPr>
+              <w:t>18</w:t>
+            </w:r>
+          </w:p>
+        </w:tc>
+        <w:tc>
+          <w:tcPr>
+            <w:tcW w:type="dxa" w:w="2160"/>
+            <w:shd w:fill="F8FAFC"/>
+            <w:vAlign w:val="center"/>
+          </w:tcPr>
+          <w:p>
+            <w:pPr>
+              <w:spacing w:before="60" w:after="60"/>
+            </w:pPr>
+            <w:r>
+              <w:rPr>
+                <w:b/>
+                <w:color w:val="0F172A"/>
+                <w:sz w:val="17"/>
+              </w:rPr>
+              <w:t>BRUNELL OMEPIEUR</w:t>
+            </w:r>
+          </w:p>
+        </w:tc>
+        <w:tc>
+          <w:tcPr>
+            <w:tcW w:type="dxa" w:w="2592"/>
+            <w:shd w:fill="F8FAFC"/>
+            <w:vAlign w:val="center"/>
+          </w:tcPr>
+          <w:p>
+            <w:pPr>
+              <w:spacing w:before="60" w:after="60"/>
+            </w:pPr>
+            <w:r>
+              <w:rPr>
+                <w:color w:val="0284C7"/>
+                <w:sz w:val="17"/>
+              </w:rPr>
+              <w:t>brunellomepieu@labelleporte.ci</w:t>
+            </w:r>
+          </w:p>
+        </w:tc>
+        <w:tc>
+          <w:tcPr>
+            <w:tcW w:type="dxa" w:w="1872"/>
+            <w:shd w:fill="F8FAFC"/>
+            <w:vAlign w:val="center"/>
+          </w:tcPr>
+          <w:p>
+            <w:pPr>
+              <w:spacing w:before="60" w:after="60"/>
+            </w:pPr>
+            <w:r>
+              <w:rPr>
+                <w:sz w:val="17"/>
+              </w:rPr>
+              <w:t>ADMINISTRATEUR SYSTEME</w:t>
+            </w:r>
+          </w:p>
+        </w:tc>
+        <w:tc>
+          <w:tcPr>
+            <w:tcW w:type="dxa" w:w="1728"/>
+            <w:shd w:fill="F8FAFC"/>
+            <w:vAlign w:val="center"/>
+          </w:tcPr>
+          <w:p>
+            <w:pPr>
+              <w:spacing w:before="60" w:after="60"/>
+            </w:pPr>
+            <w:r>
+              <w:rPr>
+                <w:sz w:val="17"/>
+              </w:rPr>
+              <w:t>Toutes les agences</w:t>
+            </w:r>
+          </w:p>
+        </w:tc>
+        <w:tc>
+          <w:tcPr>
+            <w:tcW w:type="dxa" w:w="1296"/>
+            <w:shd w:fill="F8FAFC"/>
+            <w:vAlign w:val="center"/>
+          </w:tcPr>
+          <w:p>
+            <w:pPr>
+              <w:spacing w:before="60" w:after="60"/>
+              <w:jc w:val="center"/>
+            </w:pPr>
+            <w:r>
+              <w:rPr>
+                <w:b/>
+                <w:color w:val="B91C1C"/>
+                <w:sz w:val="17"/>
+              </w:rPr>
+              <w:t>lbp2026</w:t>
+            </w:r>
+          </w:p>
+        </w:tc>
+      </w:tr>
+      <w:tr>
+        <w:tc>
+          <w:tcPr>
+            <w:tcW w:type="dxa" w:w="576"/>
+            <w:shd w:fill="FFFFFF"/>
+            <w:vAlign w:val="center"/>
+          </w:tcPr>
+          <w:p>
+            <w:pPr>
+              <w:spacing w:before="60" w:after="60"/>
+              <w:jc w:val="center"/>
+            </w:pPr>
+            <w:r>
+              <w:rPr>
+                <w:b/>
+                <w:sz w:val="17"/>
+              </w:rPr>
+              <w:t>19</w:t>
+            </w:r>
+          </w:p>
+        </w:tc>
+        <w:tc>
+          <w:tcPr>
+            <w:tcW w:type="dxa" w:w="2160"/>
+            <w:shd w:fill="FFFFFF"/>
+            <w:vAlign w:val="center"/>
+          </w:tcPr>
+          <w:p>
+            <w:pPr>
+              <w:spacing w:before="60" w:after="60"/>
+            </w:pPr>
+            <w:r>
+              <w:rPr>
+                <w:b/>
+                <w:color w:val="0F172A"/>
+                <w:sz w:val="17"/>
+              </w:rPr>
+              <w:t>SIBRI PAUL</w:t>
+            </w:r>
+          </w:p>
+        </w:tc>
+        <w:tc>
+          <w:tcPr>
+            <w:tcW w:type="dxa" w:w="2592"/>
+            <w:shd w:fill="FFFFFF"/>
+            <w:vAlign w:val="center"/>
+          </w:tcPr>
+          <w:p>
+            <w:pPr>
+              <w:spacing w:before="60" w:after="60"/>
+            </w:pPr>
+            <w:r>
+              <w:rPr>
+                <w:color w:val="0284C7"/>
+                <w:sz w:val="17"/>
+              </w:rPr>
+              <w:t>sibri.paulaime@labelleporte.ci</w:t>
+            </w:r>
+          </w:p>
+        </w:tc>
+        <w:tc>
+          <w:tcPr>
+            <w:tcW w:type="dxa" w:w="1872"/>
+            <w:shd w:fill="FFFFFF"/>
+            <w:vAlign w:val="center"/>
+          </w:tcPr>
+          <w:p>
+            <w:pPr>
+              <w:spacing w:before="60" w:after="60"/>
+            </w:pPr>
+            <w:r>
+              <w:rPr>
+                <w:sz w:val="17"/>
+              </w:rPr>
+              <w:t>COMPTABLE</w:t>
+            </w:r>
+          </w:p>
+        </w:tc>
+        <w:tc>
+          <w:tcPr>
+            <w:tcW w:type="dxa" w:w="1728"/>
+            <w:shd w:fill="FFFFFF"/>
+            <w:vAlign w:val="center"/>
+          </w:tcPr>
+          <w:p>
+            <w:pPr>
+              <w:spacing w:before="60" w:after="60"/>
+            </w:pPr>
+            <w:r>
+              <w:rPr>
+                <w:sz w:val="17"/>
+              </w:rPr>
+              <w:t>Agence Abobo Dokui</w:t>
+            </w:r>
+          </w:p>
+        </w:tc>
+        <w:tc>
+          <w:tcPr>
+            <w:tcW w:type="dxa" w:w="1296"/>
+            <w:shd w:fill="FFFFFF"/>
+            <w:vAlign w:val="center"/>
+          </w:tcPr>
+          <w:p>
+            <w:pPr>
+              <w:spacing w:before="60" w:after="60"/>
+              <w:jc w:val="center"/>
+            </w:pPr>
+            <w:r>
+              <w:rPr>
+                <w:b/>
+                <w:color w:val="B91C1C"/>
+                <w:sz w:val="17"/>
+              </w:rPr>
+              <w:t>lbp2026</w:t>
+            </w:r>
+          </w:p>
+        </w:tc>
+      </w:tr>
+      <w:tr>
+        <w:tc>
+          <w:tcPr>
+            <w:tcW w:type="dxa" w:w="576"/>
+            <w:shd w:fill="F8FAFC"/>
+            <w:vAlign w:val="center"/>
+          </w:tcPr>
+          <w:p>
+            <w:pPr>
+              <w:spacing w:before="60" w:after="60"/>
+              <w:jc w:val="center"/>
+            </w:pPr>
+            <w:r>
+              <w:rPr>
+                <w:b/>
+                <w:sz w:val="17"/>
+              </w:rPr>
+              <w:t>20</w:t>
+            </w:r>
+          </w:p>
+        </w:tc>
+        <w:tc>
+          <w:tcPr>
+            <w:tcW w:type="dxa" w:w="2160"/>
+            <w:shd w:fill="F8FAFC"/>
+            <w:vAlign w:val="center"/>
+          </w:tcPr>
+          <w:p>
+            <w:pPr>
+              <w:spacing w:before="60" w:after="60"/>
+            </w:pPr>
+            <w:r>
+              <w:rPr>
+                <w:b/>
+                <w:color w:val="0F172A"/>
+                <w:sz w:val="17"/>
+              </w:rPr>
+              <w:t>SORO IBRAHIM</w:t>
+            </w:r>
+          </w:p>
+        </w:tc>
+        <w:tc>
+          <w:tcPr>
+            <w:tcW w:type="dxa" w:w="2592"/>
+            <w:shd w:fill="F8FAFC"/>
+            <w:vAlign w:val="center"/>
+          </w:tcPr>
+          <w:p>
+            <w:pPr>
+              <w:spacing w:before="60" w:after="60"/>
+            </w:pPr>
+            <w:r>
+              <w:rPr>
+                <w:color w:val="0284C7"/>
+                <w:sz w:val="17"/>
+              </w:rPr>
+              <w:t>soro.ibrahim@labelleporte.ci</w:t>
+            </w:r>
+          </w:p>
+        </w:tc>
+        <w:tc>
+          <w:tcPr>
+            <w:tcW w:type="dxa" w:w="1872"/>
+            <w:shd w:fill="F8FAFC"/>
+            <w:vAlign w:val="center"/>
+          </w:tcPr>
+          <w:p>
+            <w:pPr>
+              <w:spacing w:before="60" w:after="60"/>
+            </w:pPr>
+            <w:r>
+              <w:rPr>
+                <w:sz w:val="17"/>
+              </w:rPr>
+              <w:t>STAGIAIRE RH</w:t>
+            </w:r>
+          </w:p>
+        </w:tc>
+        <w:tc>
+          <w:tcPr>
+            <w:tcW w:type="dxa" w:w="1728"/>
+            <w:shd w:fill="F8FAFC"/>
+            <w:vAlign w:val="center"/>
+          </w:tcPr>
+          <w:p>
+            <w:pPr>
+              <w:spacing w:before="60" w:after="60"/>
+            </w:pPr>
+            <w:r>
+              <w:rPr>
+                <w:sz w:val="17"/>
+              </w:rPr>
+              <w:t>Agence Abobo Dokui</w:t>
+            </w:r>
+          </w:p>
+        </w:tc>
+        <w:tc>
+          <w:tcPr>
+            <w:tcW w:type="dxa" w:w="1296"/>
+            <w:shd w:fill="F8FAFC"/>
+            <w:vAlign w:val="center"/>
+          </w:tcPr>
+          <w:p>
+            <w:pPr>
+              <w:spacing w:before="60" w:after="60"/>
+              <w:jc w:val="center"/>
+            </w:pPr>
+            <w:r>
+              <w:rPr>
+                <w:b/>
+                <w:color w:val="B91C1C"/>
+                <w:sz w:val="17"/>
+              </w:rPr>
+              <w:t>lbp2026</w:t>
+            </w:r>
+          </w:p>
+        </w:tc>
+      </w:tr>
+      <w:tr>
+        <w:tc>
+          <w:tcPr>
+            <w:tcW w:type="dxa" w:w="576"/>
+            <w:shd w:fill="FFFFFF"/>
+            <w:vAlign w:val="center"/>
+          </w:tcPr>
+          <w:p>
+            <w:pPr>
+              <w:spacing w:before="60" w:after="60"/>
+              <w:jc w:val="center"/>
+            </w:pPr>
+            <w:r>
+              <w:rPr>
+                <w:b/>
+                <w:sz w:val="17"/>
+              </w:rPr>
+              <w:t>21</w:t>
+            </w:r>
+          </w:p>
+        </w:tc>
+        <w:tc>
+          <w:tcPr>
+            <w:tcW w:type="dxa" w:w="2160"/>
+            <w:shd w:fill="FFFFFF"/>
+            <w:vAlign w:val="center"/>
+          </w:tcPr>
+          <w:p>
+            <w:pPr>
+              <w:spacing w:before="60" w:after="60"/>
+            </w:pPr>
+            <w:r>
+              <w:rPr>
+                <w:b/>
+                <w:color w:val="0F172A"/>
+                <w:sz w:val="17"/>
+              </w:rPr>
+              <w:t>Serge Kadjo</w:t>
+            </w:r>
+          </w:p>
+        </w:tc>
+        <w:tc>
+          <w:tcPr>
+            <w:tcW w:type="dxa" w:w="2592"/>
+            <w:shd w:fill="FFFFFF"/>
+            <w:vAlign w:val="center"/>
+          </w:tcPr>
+          <w:p>
+            <w:pPr>
+              <w:spacing w:before="60" w:after="60"/>
+            </w:pPr>
+            <w:r>
+              <w:rPr>
+                <w:color w:val="0284C7"/>
+                <w:sz w:val="17"/>
+              </w:rPr>
+              <w:t>serge.kadjo@labelleporte.ci</w:t>
+            </w:r>
+          </w:p>
+        </w:tc>
+        <w:tc>
+          <w:tcPr>
+            <w:tcW w:type="dxa" w:w="1872"/>
+            <w:shd w:fill="FFFFFF"/>
+            <w:vAlign w:val="center"/>
+          </w:tcPr>
+          <w:p>
+            <w:pPr>
+              <w:spacing w:before="60" w:after="60"/>
+            </w:pPr>
+            <w:r>
+              <w:rPr>
+                <w:sz w:val="17"/>
+              </w:rPr>
+              <w:t>DIRECTEUR GENERAL</w:t>
+            </w:r>
+          </w:p>
+        </w:tc>
+        <w:tc>
+          <w:tcPr>
+            <w:tcW w:type="dxa" w:w="1728"/>
+            <w:shd w:fill="FFFFFF"/>
+            <w:vAlign w:val="center"/>
+          </w:tcPr>
+          <w:p>
+            <w:pPr>
+              <w:spacing w:before="60" w:after="60"/>
+            </w:pPr>
+            <w:r>
+              <w:rPr>
+                <w:sz w:val="17"/>
+              </w:rPr>
+              <w:t>Toutes les agences</w:t>
+            </w:r>
+          </w:p>
+        </w:tc>
+        <w:tc>
+          <w:tcPr>
+            <w:tcW w:type="dxa" w:w="1296"/>
+            <w:shd w:fill="FFFFFF"/>
+            <w:vAlign w:val="center"/>
+          </w:tcPr>
+          <w:p>
+            <w:pPr>
+              <w:spacing w:before="60" w:after="60"/>
+              <w:jc w:val="center"/>
+            </w:pPr>
+            <w:r>
+              <w:rPr>
+                <w:b/>
+                <w:color w:val="B91C1C"/>
+                <w:sz w:val="17"/>
+              </w:rPr>
+              <w:t>lbp2026</w:t>
+            </w:r>
+          </w:p>
+        </w:tc>
+      </w:tr>
+      <w:tr>
+        <w:tc>
+          <w:tcPr>
+            <w:tcW w:type="dxa" w:w="576"/>
+            <w:shd w:fill="F8FAFC"/>
+            <w:vAlign w:val="center"/>
+          </w:tcPr>
+          <w:p>
+            <w:pPr>
+              <w:spacing w:before="60" w:after="60"/>
+              <w:jc w:val="center"/>
+            </w:pPr>
+            <w:r>
+              <w:rPr>
+                <w:b/>
+                <w:sz w:val="17"/>
+              </w:rPr>
+              <w:t>22</w:t>
+            </w:r>
+          </w:p>
+        </w:tc>
+        <w:tc>
+          <w:tcPr>
+            <w:tcW w:type="dxa" w:w="2160"/>
+            <w:shd w:fill="F8FAFC"/>
+            <w:vAlign w:val="center"/>
+          </w:tcPr>
+          <w:p>
+            <w:pPr>
+              <w:spacing w:before="60" w:after="60"/>
+            </w:pPr>
+            <w:r>
+              <w:rPr>
+                <w:b/>
+                <w:color w:val="0F172A"/>
+                <w:sz w:val="17"/>
+              </w:rPr>
+              <w:t>Adje Roxane</w:t>
+            </w:r>
+          </w:p>
+        </w:tc>
+        <w:tc>
+          <w:tcPr>
+            <w:tcW w:type="dxa" w:w="2592"/>
+            <w:shd w:fill="F8FAFC"/>
+            <w:vAlign w:val="center"/>
+          </w:tcPr>
+          <w:p>
+            <w:pPr>
+              <w:spacing w:before="60" w:after="60"/>
+            </w:pPr>
+            <w:r>
+              <w:rPr>
+                <w:color w:val="0284C7"/>
+                <w:sz w:val="17"/>
+              </w:rPr>
+              <w:t>roxane.a@labelleporte.ci</w:t>
+            </w:r>
+          </w:p>
+        </w:tc>
+        <w:tc>
+          <w:tcPr>
+            <w:tcW w:type="dxa" w:w="1872"/>
+            <w:shd w:fill="F8FAFC"/>
+            <w:vAlign w:val="center"/>
+          </w:tcPr>
+          <w:p>
+            <w:pPr>
+              <w:spacing w:before="60" w:after="60"/>
+            </w:pPr>
+            <w:r>
+              <w:rPr>
+                <w:sz w:val="17"/>
+              </w:rPr>
+              <w:t>RESPONSABLE RH</w:t>
+            </w:r>
+          </w:p>
+        </w:tc>
+        <w:tc>
+          <w:tcPr>
+            <w:tcW w:type="dxa" w:w="1728"/>
+            <w:shd w:fill="F8FAFC"/>
+            <w:vAlign w:val="center"/>
+          </w:tcPr>
+          <w:p>
+            <w:pPr>
+              <w:spacing w:before="60" w:after="60"/>
+            </w:pPr>
+            <w:r>
+              <w:rPr>
+                <w:sz w:val="17"/>
+              </w:rPr>
+              <w:t>Toutes les agences</w:t>
+            </w:r>
+          </w:p>
+        </w:tc>
+        <w:tc>
+          <w:tcPr>
+            <w:tcW w:type="dxa" w:w="1296"/>
+            <w:shd w:fill="F8FAFC"/>
+            <w:vAlign w:val="center"/>
+          </w:tcPr>
+          <w:p>
+            <w:pPr>
+              <w:spacing w:before="60" w:after="60"/>
+              <w:jc w:val="center"/>
+            </w:pPr>
+            <w:r>
+              <w:rPr>
+                <w:b/>
+                <w:color w:val="B91C1C"/>
+                <w:sz w:val="17"/>
+              </w:rPr>
+              <w:t>lbp2026</w:t>
             </w:r>
           </w:p>
         </w:tc>
@@ -3199,15 +2789,48 @@
     </w:tbl>
     <w:p>
       <w:pPr>
-        <w:spacing w:before="320"/>
-        <w:jc w:val="center"/>
+        <w:spacing w:after="200"/>
       </w:pPr>
+    </w:p>
+    <w:p>
       <w:r>
         <w:rPr>
-          <w:color w:val="718096"/>
-          <w:sz w:val="17"/>
+          <w:b/>
+          <w:color w:val="0E2B5C"/>
+          <w:sz w:val="22"/>
         </w:rPr>
-        <w:t>Document confidentiel — ERP La Belle Porte © 2026. Tous droits réservés.</w:t>
+        <w:t>GUIDE D'ADMINISTRATION &amp; PROCHAINE GESTION</w:t>
+      </w:r>
+    </w:p>
+    <w:p>
+      <w:r>
+        <w:rPr>
+          <w:b/>
+        </w:rPr>
+        <w:t xml:space="preserve">1. Déploiement BDD : </w:t>
+      </w:r>
+      <w:r>
+        <w:t>Exécuter 'php assign_staff_roles.php' sur le serveur pour configurer automatiquement les 22 profils avec rôles et droits d'accès.</w:t>
+        <w:br/>
+      </w:r>
+      <w:r>
+        <w:rPr>
+          <w:b/>
+        </w:rPr>
+        <w:t xml:space="preserve">2. Audit : </w:t>
+      </w:r>
+      <w:r>
+        <w:t>Exécuter 'php verify_staff_roles.php' pour valider l'intégrité de chaque compte.</w:t>
+        <w:br/>
+      </w:r>
+      <w:r>
+        <w:rPr>
+          <w:b/>
+        </w:rPr>
+        <w:t xml:space="preserve">3. Gestion future : </w:t>
+      </w:r>
+      <w:r>
+        <w:t>L'administrateur peut modifier directement les rôles, permissions et agences depuis le module 'Administration &gt; Utilisateurs'.</w:t>
       </w:r>
     </w:p>
     <w:sectPr>

</xml_diff>